<commit_message>
1.update the Main Doc 2.update the Abstract
</commit_message>
<xml_diff>
--- a/submission/BRCA-IV-Surgery_Gland_Surg_MAIN_DOC.docx
+++ b/submission/BRCA-IV-Surgery_Gland_Surg_MAIN_DOC.docx
@@ -12,8 +12,6 @@
           <w:sz w:val="20"/>
         </w:rPr>
       </w:pPr>
-      <w:bookmarkStart w:id="60" w:name="_GoBack"/>
-      <w:bookmarkEnd w:id="60"/>
     </w:p>
     <w:p>
       <w:pPr>
@@ -2816,9 +2814,9 @@
       </w:pPr>
       <w:bookmarkStart w:id="2" w:name="Eligibility Criteria and Patient Informa"/>
       <w:bookmarkEnd w:id="2"/>
-      <w:bookmarkStart w:id="3" w:name="Method"/>
+      <w:bookmarkStart w:id="3" w:name="Eligibility Criteria and Patient Informa"/>
       <w:bookmarkEnd w:id="3"/>
-      <w:bookmarkStart w:id="4" w:name="Eligibility Criteria and Patient Informa"/>
+      <w:bookmarkStart w:id="4" w:name="Method"/>
       <w:bookmarkEnd w:id="4"/>
       <w:r>
         <w:rPr>
@@ -3305,11 +3303,348 @@
         <w:rPr>
           <w:spacing w:val="-3"/>
         </w:rPr>
-        <w:t>2021.We</w:t>
-      </w:r>
-      <w:r>
-        <w:rPr>
-          <w:spacing w:val="-21"/>
+        <w:t>2021.</w:t>
+      </w:r>
+      <w:r>
+        <w:rPr>
+          <w:rFonts w:hint="eastAsia"/>
+          <w:spacing w:val="-3"/>
+        </w:rPr>
+        <w:t>Cases were included if they met the following two criteria</w:t>
+      </w:r>
+      <w:r>
+        <w:t>:(1)histological diagnosis of M1 breast cancer in female patients diagnosed between January 2013 and December 2018; and</w:t>
+      </w:r>
+      <w:r>
+        <w:rPr>
+          <w:spacing w:val="-6"/>
+        </w:rPr>
+        <w:t xml:space="preserve"> </w:t>
+      </w:r>
+      <w:r>
+        <w:t>(2)</w:t>
+      </w:r>
+      <w:r>
+        <w:rPr>
+          <w:spacing w:val="-5"/>
+        </w:rPr>
+        <w:t xml:space="preserve"> </w:t>
+      </w:r>
+      <w:r>
+        <w:t>the</w:t>
+      </w:r>
+      <w:r>
+        <w:rPr>
+          <w:spacing w:val="-5"/>
+        </w:rPr>
+        <w:t xml:space="preserve"> </w:t>
+      </w:r>
+      <w:r>
+        <w:t>presence</w:t>
+      </w:r>
+      <w:r>
+        <w:rPr>
+          <w:spacing w:val="-6"/>
+        </w:rPr>
+        <w:t xml:space="preserve"> </w:t>
+      </w:r>
+      <w:r>
+        <w:t>of</w:t>
+      </w:r>
+      <w:r>
+        <w:rPr>
+          <w:spacing w:val="-5"/>
+        </w:rPr>
+        <w:t xml:space="preserve"> </w:t>
+      </w:r>
+      <w:r>
+        <w:t>one</w:t>
+      </w:r>
+      <w:r>
+        <w:rPr>
+          <w:spacing w:val="-5"/>
+        </w:rPr>
+        <w:t xml:space="preserve"> </w:t>
+      </w:r>
+      <w:r>
+        <w:t>malignant</w:t>
+      </w:r>
+      <w:r>
+        <w:rPr>
+          <w:spacing w:val="-5"/>
+        </w:rPr>
+        <w:t xml:space="preserve"> </w:t>
+      </w:r>
+      <w:r>
+        <w:t>lesion.</w:t>
+      </w:r>
+      <w:r>
+        <w:rPr>
+          <w:spacing w:val="-6"/>
+        </w:rPr>
+        <w:t xml:space="preserve"> </w:t>
+      </w:r>
+      <w:r>
+        <w:t>On</w:t>
+      </w:r>
+      <w:r>
+        <w:rPr>
+          <w:spacing w:val="-5"/>
+        </w:rPr>
+        <w:t xml:space="preserve"> </w:t>
+      </w:r>
+      <w:r>
+        <w:t>the</w:t>
+      </w:r>
+      <w:r>
+        <w:rPr>
+          <w:spacing w:val="-5"/>
+        </w:rPr>
+        <w:t xml:space="preserve"> </w:t>
+      </w:r>
+      <w:r>
+        <w:t>contrary,</w:t>
+      </w:r>
+      <w:r>
+        <w:rPr>
+          <w:spacing w:val="-5"/>
+        </w:rPr>
+        <w:t xml:space="preserve"> </w:t>
+      </w:r>
+      <w:r>
+        <w:t>we</w:t>
+      </w:r>
+      <w:r>
+        <w:rPr>
+          <w:spacing w:val="-6"/>
+        </w:rPr>
+        <w:t xml:space="preserve"> </w:t>
+      </w:r>
+      <w:r>
+        <w:t>eliminated</w:t>
+      </w:r>
+      <w:r>
+        <w:rPr>
+          <w:spacing w:val="-5"/>
+        </w:rPr>
+        <w:t xml:space="preserve"> </w:t>
+      </w:r>
+      <w:r>
+        <w:t>instances</w:t>
+      </w:r>
+      <w:r>
+        <w:rPr>
+          <w:spacing w:val="-5"/>
+        </w:rPr>
+        <w:t xml:space="preserve"> </w:t>
+      </w:r>
+      <w:r>
+        <w:t>cases</w:t>
+      </w:r>
+      <w:r>
+        <w:rPr>
+          <w:spacing w:val="-5"/>
+        </w:rPr>
+        <w:t xml:space="preserve"> </w:t>
+      </w:r>
+      <w:r>
+        <w:t>that</w:t>
+      </w:r>
+      <w:r>
+        <w:rPr>
+          <w:spacing w:val="-6"/>
+        </w:rPr>
+        <w:t xml:space="preserve"> </w:t>
+      </w:r>
+      <w:r>
+        <w:t>fulfilled the</w:t>
+      </w:r>
+      <w:r>
+        <w:rPr>
+          <w:spacing w:val="-7"/>
+        </w:rPr>
+        <w:t xml:space="preserve"> </w:t>
+      </w:r>
+      <w:r>
+        <w:t>following</w:t>
+      </w:r>
+      <w:r>
+        <w:rPr>
+          <w:spacing w:val="-6"/>
+        </w:rPr>
+        <w:t xml:space="preserve"> </w:t>
+      </w:r>
+      <w:r>
+        <w:t>criteria:</w:t>
+      </w:r>
+      <w:r>
+        <w:rPr>
+          <w:spacing w:val="-6"/>
+        </w:rPr>
+        <w:t xml:space="preserve"> </w:t>
+      </w:r>
+      <w:r>
+        <w:t>(1)</w:t>
+      </w:r>
+      <w:r>
+        <w:rPr>
+          <w:spacing w:val="-6"/>
+        </w:rPr>
+        <w:t xml:space="preserve"> </w:t>
+      </w:r>
+      <w:r>
+        <w:t>individuals</w:t>
+      </w:r>
+      <w:r>
+        <w:rPr>
+          <w:spacing w:val="-6"/>
+        </w:rPr>
+        <w:t xml:space="preserve"> </w:t>
+      </w:r>
+      <w:r>
+        <w:t>having</w:t>
+      </w:r>
+      <w:r>
+        <w:rPr>
+          <w:spacing w:val="-7"/>
+        </w:rPr>
+        <w:t xml:space="preserve"> </w:t>
+      </w:r>
+      <w:r>
+        <w:t>ambiguous</w:t>
+      </w:r>
+      <w:r>
+        <w:rPr>
+          <w:spacing w:val="-6"/>
+        </w:rPr>
+        <w:t xml:space="preserve"> </w:t>
+      </w:r>
+      <w:r>
+        <w:t>or</w:t>
+      </w:r>
+      <w:r>
+        <w:rPr>
+          <w:spacing w:val="-6"/>
+        </w:rPr>
+        <w:t xml:space="preserve"> </w:t>
+      </w:r>
+      <w:r>
+        <w:t>incomplete</w:t>
+      </w:r>
+      <w:r>
+        <w:rPr>
+          <w:spacing w:val="-6"/>
+        </w:rPr>
+        <w:t xml:space="preserve"> </w:t>
+      </w:r>
+      <w:r>
+        <w:t>Metastasis</w:t>
+      </w:r>
+      <w:r>
+        <w:rPr>
+          <w:spacing w:val="-6"/>
+        </w:rPr>
+        <w:t xml:space="preserve"> </w:t>
+      </w:r>
+      <w:r>
+        <w:t>location.</w:t>
+      </w:r>
+      <w:r>
+        <w:rPr>
+          <w:spacing w:val="-6"/>
+        </w:rPr>
+        <w:t xml:space="preserve"> </w:t>
+      </w:r>
+      <w:r>
+        <w:t>Demographic data (age and marital status at diagnosis), characteristics specific to breast cancer (TNM stage, histology type, tumor laterality, breast Subtype, grade, ER status, PR status, metastasis location), and information about</w:t>
+      </w:r>
+      <w:r>
+        <w:rPr>
+          <w:spacing w:val="-18"/>
+        </w:rPr>
+        <w:t xml:space="preserve"> </w:t>
+      </w:r>
+      <w:r>
+        <w:t>treatment</w:t>
+      </w:r>
+      <w:r>
+        <w:rPr>
+          <w:spacing w:val="-17"/>
+        </w:rPr>
+        <w:t xml:space="preserve"> </w:t>
+      </w:r>
+      <w:r>
+        <w:t>(primary</w:t>
+      </w:r>
+      <w:r>
+        <w:rPr>
+          <w:spacing w:val="-17"/>
+        </w:rPr>
+        <w:t xml:space="preserve"> </w:t>
+      </w:r>
+      <w:r>
+        <w:t>site</w:t>
+      </w:r>
+      <w:r>
+        <w:rPr>
+          <w:spacing w:val="-17"/>
+        </w:rPr>
+        <w:t xml:space="preserve"> </w:t>
+      </w:r>
+      <w:r>
+        <w:rPr>
+          <w:spacing w:val="-3"/>
+        </w:rPr>
+        <w:t>surgery,</w:t>
+      </w:r>
+      <w:r>
+        <w:rPr>
+          <w:spacing w:val="-16"/>
+        </w:rPr>
+        <w:t xml:space="preserve"> </w:t>
+      </w:r>
+      <w:r>
+        <w:t>radiation,</w:t>
+      </w:r>
+      <w:r>
+        <w:rPr>
+          <w:spacing w:val="-16"/>
+        </w:rPr>
+        <w:t xml:space="preserve"> </w:t>
+      </w:r>
+      <w:r>
+        <w:t>and</w:t>
+      </w:r>
+      <w:r>
+        <w:rPr>
+          <w:spacing w:val="-17"/>
+        </w:rPr>
+        <w:t xml:space="preserve"> </w:t>
+      </w:r>
+      <w:r>
+        <w:t>chemotherapy)</w:t>
+      </w:r>
+      <w:r>
+        <w:rPr>
+          <w:spacing w:val="-18"/>
+        </w:rPr>
+        <w:t xml:space="preserve"> </w:t>
+      </w:r>
+      <w:r>
+        <w:t>were</w:t>
+      </w:r>
+      <w:r>
+        <w:rPr>
+          <w:spacing w:val="-17"/>
+        </w:rPr>
+        <w:t xml:space="preserve"> </w:t>
+      </w:r>
+      <w:r>
+        <w:t>all</w:t>
+      </w:r>
+      <w:r>
+        <w:rPr>
+          <w:spacing w:val="-17"/>
         </w:rPr>
         <w:t xml:space="preserve"> </w:t>
       </w:r>
@@ -3318,34 +3653,16 @@
       </w:r>
       <w:r>
         <w:rPr>
-          <w:spacing w:val="-21"/>
-        </w:rPr>
-        <w:t xml:space="preserve"> </w:t>
-      </w:r>
-      <w:r>
-        <w:t>cases</w:t>
-      </w:r>
-      <w:r>
-        <w:rPr>
-          <w:spacing w:val="-20"/>
-        </w:rPr>
-        <w:t xml:space="preserve"> </w:t>
-      </w:r>
-      <w:r>
-        <w:t>that</w:t>
-      </w:r>
-      <w:r>
-        <w:rPr>
-          <w:spacing w:val="-21"/>
-        </w:rPr>
-        <w:t xml:space="preserve"> </w:t>
-      </w:r>
-      <w:r>
-        <w:t>met</w:t>
-      </w:r>
-      <w:r>
-        <w:rPr>
-          <w:spacing w:val="-22"/>
+          <w:spacing w:val="-17"/>
+        </w:rPr>
+        <w:t xml:space="preserve"> </w:t>
+      </w:r>
+      <w:r>
+        <w:t>in</w:t>
+      </w:r>
+      <w:r>
+        <w:rPr>
+          <w:spacing w:val="-17"/>
         </w:rPr>
         <w:t xml:space="preserve"> </w:t>
       </w:r>
@@ -3354,312 +3671,12 @@
       </w:r>
       <w:r>
         <w:rPr>
-          <w:spacing w:val="-21"/>
-        </w:rPr>
-        <w:t xml:space="preserve"> </w:t>
-      </w:r>
-      <w:r>
-        <w:t>following</w:t>
-      </w:r>
-      <w:r>
-        <w:rPr>
-          <w:spacing w:val="-21"/>
-        </w:rPr>
-        <w:t xml:space="preserve"> </w:t>
-      </w:r>
-      <w:r>
-        <w:t>two</w:t>
-      </w:r>
-      <w:r>
-        <w:rPr>
-          <w:spacing w:val="-22"/>
-        </w:rPr>
-        <w:t xml:space="preserve"> </w:t>
-      </w:r>
-      <w:r>
-        <w:t>criteria:(1)histological diagnosis of M1 breast cancer in female patients diagnosed between January 2013 and December 2018; and</w:t>
-      </w:r>
-      <w:r>
-        <w:rPr>
-          <w:spacing w:val="-6"/>
-        </w:rPr>
-        <w:t xml:space="preserve"> </w:t>
-      </w:r>
-      <w:r>
-        <w:t>(2)</w:t>
-      </w:r>
-      <w:r>
-        <w:rPr>
-          <w:spacing w:val="-5"/>
-        </w:rPr>
-        <w:t xml:space="preserve"> </w:t>
-      </w:r>
-      <w:r>
-        <w:t>the</w:t>
-      </w:r>
-      <w:r>
-        <w:rPr>
-          <w:spacing w:val="-5"/>
-        </w:rPr>
-        <w:t xml:space="preserve"> </w:t>
-      </w:r>
-      <w:r>
-        <w:t>presence</w:t>
-      </w:r>
-      <w:r>
-        <w:rPr>
-          <w:spacing w:val="-6"/>
-        </w:rPr>
-        <w:t xml:space="preserve"> </w:t>
-      </w:r>
-      <w:r>
-        <w:t>of</w:t>
-      </w:r>
-      <w:r>
-        <w:rPr>
-          <w:spacing w:val="-5"/>
-        </w:rPr>
-        <w:t xml:space="preserve"> </w:t>
-      </w:r>
-      <w:r>
-        <w:t>one</w:t>
-      </w:r>
-      <w:r>
-        <w:rPr>
-          <w:spacing w:val="-5"/>
-        </w:rPr>
-        <w:t xml:space="preserve"> </w:t>
-      </w:r>
-      <w:r>
-        <w:t>malignant</w:t>
-      </w:r>
-      <w:r>
-        <w:rPr>
-          <w:spacing w:val="-5"/>
-        </w:rPr>
-        <w:t xml:space="preserve"> </w:t>
-      </w:r>
-      <w:r>
-        <w:t>lesion.</w:t>
-      </w:r>
-      <w:r>
-        <w:rPr>
-          <w:spacing w:val="-6"/>
-        </w:rPr>
-        <w:t xml:space="preserve"> </w:t>
-      </w:r>
-      <w:r>
-        <w:t>On</w:t>
-      </w:r>
-      <w:r>
-        <w:rPr>
-          <w:spacing w:val="-5"/>
-        </w:rPr>
-        <w:t xml:space="preserve"> </w:t>
-      </w:r>
-      <w:r>
-        <w:t>the</w:t>
-      </w:r>
-      <w:r>
-        <w:rPr>
-          <w:spacing w:val="-5"/>
-        </w:rPr>
-        <w:t xml:space="preserve"> </w:t>
-      </w:r>
-      <w:r>
-        <w:t>contrary,</w:t>
-      </w:r>
-      <w:r>
-        <w:rPr>
-          <w:spacing w:val="-5"/>
-        </w:rPr>
-        <w:t xml:space="preserve"> </w:t>
-      </w:r>
-      <w:r>
-        <w:t>we</w:t>
-      </w:r>
-      <w:r>
-        <w:rPr>
-          <w:spacing w:val="-6"/>
-        </w:rPr>
-        <w:t xml:space="preserve"> </w:t>
-      </w:r>
-      <w:r>
-        <w:t>eliminated</w:t>
-      </w:r>
-      <w:r>
-        <w:rPr>
-          <w:spacing w:val="-5"/>
-        </w:rPr>
-        <w:t xml:space="preserve"> </w:t>
-      </w:r>
-      <w:r>
-        <w:t>instances</w:t>
-      </w:r>
-      <w:r>
-        <w:rPr>
-          <w:spacing w:val="-5"/>
-        </w:rPr>
-        <w:t xml:space="preserve"> </w:t>
-      </w:r>
-      <w:r>
-        <w:t>cases</w:t>
-      </w:r>
-      <w:r>
-        <w:rPr>
-          <w:spacing w:val="-5"/>
-        </w:rPr>
-        <w:t xml:space="preserve"> </w:t>
-      </w:r>
-      <w:r>
-        <w:t>that</w:t>
-      </w:r>
-      <w:r>
-        <w:rPr>
-          <w:spacing w:val="-6"/>
-        </w:rPr>
-        <w:t xml:space="preserve"> </w:t>
-      </w:r>
-      <w:r>
-        <w:t>fulfilled the</w:t>
-      </w:r>
-      <w:r>
-        <w:rPr>
-          <w:spacing w:val="-7"/>
-        </w:rPr>
-        <w:t xml:space="preserve"> </w:t>
-      </w:r>
-      <w:r>
-        <w:t>following</w:t>
-      </w:r>
-      <w:r>
-        <w:rPr>
-          <w:spacing w:val="-6"/>
-        </w:rPr>
-        <w:t xml:space="preserve"> </w:t>
-      </w:r>
-      <w:r>
-        <w:t>criteria:</w:t>
-      </w:r>
-      <w:r>
-        <w:rPr>
-          <w:spacing w:val="-6"/>
-        </w:rPr>
-        <w:t xml:space="preserve"> </w:t>
-      </w:r>
-      <w:r>
-        <w:t>(1)</w:t>
-      </w:r>
-      <w:r>
-        <w:rPr>
-          <w:spacing w:val="-6"/>
-        </w:rPr>
-        <w:t xml:space="preserve"> </w:t>
-      </w:r>
-      <w:r>
-        <w:t>individuals</w:t>
-      </w:r>
-      <w:r>
-        <w:rPr>
-          <w:spacing w:val="-6"/>
-        </w:rPr>
-        <w:t xml:space="preserve"> </w:t>
-      </w:r>
-      <w:r>
-        <w:t>having</w:t>
-      </w:r>
-      <w:r>
-        <w:rPr>
-          <w:spacing w:val="-7"/>
-        </w:rPr>
-        <w:t xml:space="preserve"> </w:t>
-      </w:r>
-      <w:r>
-        <w:t>ambiguous</w:t>
-      </w:r>
-      <w:r>
-        <w:rPr>
-          <w:spacing w:val="-6"/>
-        </w:rPr>
-        <w:t xml:space="preserve"> </w:t>
-      </w:r>
-      <w:r>
-        <w:t>or</w:t>
-      </w:r>
-      <w:r>
-        <w:rPr>
-          <w:spacing w:val="-6"/>
-        </w:rPr>
-        <w:t xml:space="preserve"> </w:t>
-      </w:r>
-      <w:r>
-        <w:t>incomplete</w:t>
-      </w:r>
-      <w:r>
-        <w:rPr>
-          <w:spacing w:val="-6"/>
-        </w:rPr>
-        <w:t xml:space="preserve"> </w:t>
-      </w:r>
-      <w:r>
-        <w:t>Metastasis</w:t>
-      </w:r>
-      <w:r>
-        <w:rPr>
-          <w:spacing w:val="-6"/>
-        </w:rPr>
-        <w:t xml:space="preserve"> </w:t>
-      </w:r>
-      <w:r>
-        <w:t>location.</w:t>
-      </w:r>
-      <w:r>
-        <w:rPr>
-          <w:spacing w:val="-6"/>
-        </w:rPr>
-        <w:t xml:space="preserve"> </w:t>
-      </w:r>
-      <w:r>
-        <w:t>Demographic data (age and marital status at diagnosis), characteristics specific to breast cancer (TNM stage, histology type, tumor laterality, breast Subtype, grade, ER status, PR status, metastasis location), and information about</w:t>
-      </w:r>
-      <w:r>
-        <w:rPr>
-          <w:spacing w:val="-18"/>
-        </w:rPr>
-        <w:t xml:space="preserve"> </w:t>
-      </w:r>
-      <w:r>
-        <w:t>treatment</w:t>
-      </w:r>
-      <w:r>
-        <w:rPr>
           <w:spacing w:val="-17"/>
         </w:rPr>
         <w:t xml:space="preserve"> </w:t>
       </w:r>
       <w:r>
-        <w:t>(primary</w:t>
-      </w:r>
-      <w:r>
-        <w:rPr>
-          <w:spacing w:val="-17"/>
-        </w:rPr>
-        <w:t xml:space="preserve"> </w:t>
-      </w:r>
-      <w:r>
-        <w:t>site</w:t>
-      </w:r>
-      <w:r>
-        <w:rPr>
-          <w:spacing w:val="-17"/>
-        </w:rPr>
-        <w:t xml:space="preserve"> </w:t>
-      </w:r>
-      <w:r>
-        <w:rPr>
-          <w:spacing w:val="-3"/>
-        </w:rPr>
-        <w:t>surgery,</w:t>
+        <w:t>data.</w:t>
       </w:r>
       <w:r>
         <w:rPr>
@@ -3668,106 +3685,10 @@
         <w:t xml:space="preserve"> </w:t>
       </w:r>
       <w:r>
-        <w:t>radiation,</w:t>
-      </w:r>
-      <w:r>
-        <w:rPr>
-          <w:spacing w:val="-16"/>
-        </w:rPr>
-        <w:t xml:space="preserve"> </w:t>
-      </w:r>
-      <w:r>
-        <w:t>and</w:t>
-      </w:r>
-      <w:r>
-        <w:rPr>
-          <w:spacing w:val="-17"/>
-        </w:rPr>
-        <w:t xml:space="preserve"> </w:t>
-      </w:r>
-      <w:r>
-        <w:t>chemotherapy)</w:t>
-      </w:r>
-      <w:r>
-        <w:rPr>
-          <w:spacing w:val="-18"/>
-        </w:rPr>
-        <w:t xml:space="preserve"> </w:t>
-      </w:r>
-      <w:r>
-        <w:t>were</w:t>
-      </w:r>
-      <w:r>
-        <w:rPr>
-          <w:spacing w:val="-17"/>
-        </w:rPr>
-        <w:t xml:space="preserve"> </w:t>
-      </w:r>
-      <w:r>
-        <w:t>all</w:t>
-      </w:r>
-      <w:r>
-        <w:rPr>
-          <w:spacing w:val="-17"/>
-        </w:rPr>
-        <w:t xml:space="preserve"> </w:t>
-      </w:r>
-      <w:r>
-        <w:t>included</w:t>
-      </w:r>
-      <w:r>
-        <w:rPr>
-          <w:spacing w:val="-17"/>
-        </w:rPr>
-        <w:t xml:space="preserve"> </w:t>
-      </w:r>
-      <w:r>
-        <w:t>in</w:t>
-      </w:r>
-      <w:r>
-        <w:rPr>
-          <w:spacing w:val="-17"/>
-        </w:rPr>
-        <w:t xml:space="preserve"> </w:t>
-      </w:r>
-      <w:r>
-        <w:t>the</w:t>
-      </w:r>
-      <w:r>
-        <w:rPr>
-          <w:spacing w:val="-17"/>
-        </w:rPr>
-        <w:t xml:space="preserve"> </w:t>
-      </w:r>
-      <w:r>
-        <w:t>data.</w:t>
-      </w:r>
-      <w:r>
-        <w:rPr>
-          <w:spacing w:val="-16"/>
-        </w:rPr>
-        <w:t xml:space="preserve"> </w:t>
-      </w:r>
-      <w:r>
-        <w:t>The</w:t>
-      </w:r>
-      <w:r>
-        <w:rPr>
-          <w:spacing w:val="-17"/>
-        </w:rPr>
-        <w:t xml:space="preserve"> </w:t>
-      </w:r>
-      <w:r>
-        <w:t>main outcomes of interest were the patient survival time and mortality</w:t>
-      </w:r>
-      <w:r>
-        <w:rPr>
-          <w:spacing w:val="-19"/>
-        </w:rPr>
-        <w:t xml:space="preserve"> </w:t>
-      </w:r>
-      <w:r>
-        <w:t>indicator.</w:t>
+        <w:rPr>
+          <w:rFonts w:hint="eastAsia"/>
+        </w:rPr>
+        <w:t>The key outcomes measured included survival time and mortality indicator.</w:t>
       </w:r>
     </w:p>
     <w:p>
@@ -4277,7 +4198,20 @@
         <w:rPr>
           <w:rFonts w:hint="eastAsia"/>
         </w:rPr>
-        <w:t>The models were developed using Python version 3.9. The deep learning model was implemented with PyTorch version 1.11.0, while the penalized Cox proportional hazards model was trained using PySurvival version 0.1.2. The code and dataset for reproducing the deep learning model are available at: https://github.com/snowflake-Zhao/brca-IV-surgery.</w:t>
+        <w:t>The</w:t>
+      </w:r>
+      <w:r>
+        <w:rPr>
+          <w:rFonts w:hint="eastAsia" w:eastAsia="宋体"/>
+          <w:lang w:val="en-US" w:eastAsia="zh-CN"/>
+        </w:rPr>
+        <w:t xml:space="preserve"> m</w:t>
+      </w:r>
+      <w:r>
+        <w:rPr>
+          <w:rFonts w:hint="eastAsia"/>
+        </w:rPr>
+        <w:t>odel development was conducted in Python 3.9. Implementation of the deep learning model employed PyTorch version 1.11.0, while the penalized Cox proportional hazards model was built using PySurvival version 0.1.2.The code and dataset for reproducing the deep learning model are available at: https://github.com/snowflake-Zhao/brca-IV-surgery.</w:t>
       </w:r>
     </w:p>
     <w:p>
@@ -4305,11 +4239,11 @@
         <w:ind w:left="577" w:right="0" w:hanging="404"/>
         <w:jc w:val="left"/>
       </w:pPr>
-      <w:bookmarkStart w:id="10" w:name="Results"/>
+      <w:bookmarkStart w:id="10" w:name="Patient Baseline Characteristics"/>
       <w:bookmarkEnd w:id="10"/>
       <w:bookmarkStart w:id="11" w:name="Patient Baseline Characteristics"/>
       <w:bookmarkEnd w:id="11"/>
-      <w:bookmarkStart w:id="12" w:name="Patient Baseline Characteristics"/>
+      <w:bookmarkStart w:id="12" w:name="Results"/>
       <w:bookmarkEnd w:id="12"/>
       <w:r>
         <w:rPr>
@@ -4537,14 +4471,6 @@
                   </w:tr>
                   <w:tr>
                     <w:tblPrEx>
-                      <w:tblBorders>
-                        <w:top w:val="none" w:color="auto" w:sz="0" w:space="0"/>
-                        <w:left w:val="none" w:color="auto" w:sz="0" w:space="0"/>
-                        <w:bottom w:val="none" w:color="auto" w:sz="0" w:space="0"/>
-                        <w:right w:val="none" w:color="auto" w:sz="0" w:space="0"/>
-                        <w:insideH w:val="none" w:color="auto" w:sz="0" w:space="0"/>
-                        <w:insideV w:val="none" w:color="auto" w:sz="0" w:space="0"/>
-                      </w:tblBorders>
                       <w:tblCellMar>
                         <w:top w:w="0" w:type="dxa"/>
                         <w:left w:w="0" w:type="dxa"/>
@@ -5003,6 +4929,14 @@
                   </w:tr>
                   <w:tr>
                     <w:tblPrEx>
+                      <w:tblBorders>
+                        <w:top w:val="none" w:color="auto" w:sz="0" w:space="0"/>
+                        <w:left w:val="none" w:color="auto" w:sz="0" w:space="0"/>
+                        <w:bottom w:val="none" w:color="auto" w:sz="0" w:space="0"/>
+                        <w:right w:val="none" w:color="auto" w:sz="0" w:space="0"/>
+                        <w:insideH w:val="none" w:color="auto" w:sz="0" w:space="0"/>
+                        <w:insideV w:val="none" w:color="auto" w:sz="0" w:space="0"/>
+                      </w:tblBorders>
                       <w:tblCellMar>
                         <w:top w:w="0" w:type="dxa"/>
                         <w:left w:w="0" w:type="dxa"/>
@@ -6365,6 +6299,14 @@
                   </w:tr>
                   <w:tr>
                     <w:tblPrEx>
+                      <w:tblBorders>
+                        <w:top w:val="none" w:color="auto" w:sz="0" w:space="0"/>
+                        <w:left w:val="none" w:color="auto" w:sz="0" w:space="0"/>
+                        <w:bottom w:val="none" w:color="auto" w:sz="0" w:space="0"/>
+                        <w:right w:val="none" w:color="auto" w:sz="0" w:space="0"/>
+                        <w:insideH w:val="none" w:color="auto" w:sz="0" w:space="0"/>
+                        <w:insideV w:val="none" w:color="auto" w:sz="0" w:space="0"/>
+                      </w:tblBorders>
                       <w:tblCellMar>
                         <w:top w:w="0" w:type="dxa"/>
                         <w:left w:w="0" w:type="dxa"/>
@@ -6770,14 +6712,6 @@
                   </w:tr>
                   <w:tr>
                     <w:tblPrEx>
-                      <w:tblBorders>
-                        <w:top w:val="none" w:color="auto" w:sz="0" w:space="0"/>
-                        <w:left w:val="none" w:color="auto" w:sz="0" w:space="0"/>
-                        <w:bottom w:val="none" w:color="auto" w:sz="0" w:space="0"/>
-                        <w:right w:val="none" w:color="auto" w:sz="0" w:space="0"/>
-                        <w:insideH w:val="none" w:color="auto" w:sz="0" w:space="0"/>
-                        <w:insideV w:val="none" w:color="auto" w:sz="0" w:space="0"/>
-                      </w:tblBorders>
                       <w:tblCellMar>
                         <w:top w:w="0" w:type="dxa"/>
                         <w:left w:w="0" w:type="dxa"/>
@@ -7313,14 +7247,6 @@
                   </w:tr>
                   <w:tr>
                     <w:tblPrEx>
-                      <w:tblBorders>
-                        <w:top w:val="none" w:color="auto" w:sz="0" w:space="0"/>
-                        <w:left w:val="none" w:color="auto" w:sz="0" w:space="0"/>
-                        <w:bottom w:val="none" w:color="auto" w:sz="0" w:space="0"/>
-                        <w:right w:val="none" w:color="auto" w:sz="0" w:space="0"/>
-                        <w:insideH w:val="none" w:color="auto" w:sz="0" w:space="0"/>
-                        <w:insideV w:val="none" w:color="auto" w:sz="0" w:space="0"/>
-                      </w:tblBorders>
                       <w:tblCellMar>
                         <w:top w:w="0" w:type="dxa"/>
                         <w:left w:w="0" w:type="dxa"/>
@@ -10949,7 +10875,10 @@
         <w:t xml:space="preserve">Figure 2. </w:t>
       </w:r>
       <w:r>
-        <w:t>The average impact of the top 10 features from the neural network on output magnitude.The x-axis represents the mean value of shapley value, and the y-axis represents name of the input feature of the neural network</w:t>
+        <w:rPr>
+          <w:rFonts w:hint="eastAsia"/>
+        </w:rPr>
+        <w:t>The average influence of the top 10 neural network features on the output magnitude is shown. The x-axis represents the mean Shapley value, while the y-axis displays the names of the neural network’s input features.</w:t>
       </w:r>
     </w:p>
     <w:p>
@@ -11043,151 +10972,10 @@
         <w:t xml:space="preserve">Figure 3. </w:t>
       </w:r>
       <w:r>
-        <w:t>The individual feature impact of the top 8 features from the neural network on output magnitude.The</w:t>
-      </w:r>
-      <w:r>
-        <w:rPr>
-          <w:spacing w:val="-10"/>
-        </w:rPr>
-        <w:t xml:space="preserve"> </w:t>
-      </w:r>
-      <w:r>
-        <w:t>x-axis</w:t>
-      </w:r>
-      <w:r>
-        <w:rPr>
-          <w:spacing w:val="-10"/>
-        </w:rPr>
-        <w:t xml:space="preserve"> </w:t>
-      </w:r>
-      <w:r>
-        <w:t>represents</w:t>
-      </w:r>
-      <w:r>
-        <w:rPr>
-          <w:spacing w:val="-10"/>
-        </w:rPr>
-        <w:t xml:space="preserve"> </w:t>
-      </w:r>
-      <w:r>
-        <w:t>the</w:t>
-      </w:r>
-      <w:r>
-        <w:rPr>
-          <w:spacing w:val="-10"/>
-        </w:rPr>
-        <w:t xml:space="preserve"> </w:t>
-      </w:r>
-      <w:r>
-        <w:t>shapley</w:t>
-      </w:r>
-      <w:r>
-        <w:rPr>
-          <w:spacing w:val="-10"/>
-        </w:rPr>
-        <w:t xml:space="preserve"> </w:t>
-      </w:r>
-      <w:r>
-        <w:t>value</w:t>
-      </w:r>
-      <w:r>
-        <w:rPr>
-          <w:spacing w:val="-10"/>
-        </w:rPr>
-        <w:t xml:space="preserve"> </w:t>
-      </w:r>
-      <w:r>
-        <w:t>of</w:t>
-      </w:r>
-      <w:r>
-        <w:rPr>
-          <w:spacing w:val="-10"/>
-        </w:rPr>
-        <w:t xml:space="preserve"> </w:t>
-      </w:r>
-      <w:r>
-        <w:t>the</w:t>
-      </w:r>
-      <w:r>
-        <w:rPr>
-          <w:spacing w:val="-10"/>
-        </w:rPr>
-        <w:t xml:space="preserve"> </w:t>
-      </w:r>
-      <w:r>
-        <w:t>related</w:t>
-      </w:r>
-      <w:r>
-        <w:rPr>
-          <w:spacing w:val="-10"/>
-        </w:rPr>
-        <w:t xml:space="preserve"> </w:t>
-      </w:r>
-      <w:r>
-        <w:t>feature</w:t>
-      </w:r>
-      <w:r>
-        <w:rPr>
-          <w:spacing w:val="-10"/>
-        </w:rPr>
-        <w:t xml:space="preserve"> </w:t>
-      </w:r>
-      <w:r>
-        <w:t>and</w:t>
-      </w:r>
-      <w:r>
-        <w:rPr>
-          <w:spacing w:val="-10"/>
-        </w:rPr>
-        <w:t xml:space="preserve"> </w:t>
-      </w:r>
-      <w:r>
-        <w:t>the</w:t>
-      </w:r>
-      <w:r>
-        <w:rPr>
-          <w:spacing w:val="-10"/>
-        </w:rPr>
-        <w:t xml:space="preserve"> </w:t>
-      </w:r>
-      <w:r>
-        <w:t>y-axis</w:t>
-      </w:r>
-      <w:r>
-        <w:rPr>
-          <w:spacing w:val="-10"/>
-        </w:rPr>
-        <w:t xml:space="preserve"> </w:t>
-      </w:r>
-      <w:r>
-        <w:t>represents</w:t>
-      </w:r>
-      <w:r>
-        <w:rPr>
-          <w:spacing w:val="-9"/>
-        </w:rPr>
-        <w:t xml:space="preserve"> </w:t>
-      </w:r>
-      <w:r>
-        <w:t>name</w:t>
-      </w:r>
-      <w:r>
-        <w:rPr>
-          <w:spacing w:val="-10"/>
-        </w:rPr>
-        <w:t xml:space="preserve"> </w:t>
-      </w:r>
-      <w:r>
-        <w:t>of the input feature of the neural</w:t>
-      </w:r>
-      <w:r>
-        <w:rPr>
-          <w:spacing w:val="-7"/>
-        </w:rPr>
-        <w:t xml:space="preserve"> </w:t>
-      </w:r>
-      <w:r>
-        <w:t>network</w:t>
+        <w:rPr>
+          <w:rFonts w:hint="eastAsia"/>
+        </w:rPr>
+        <w:t>The individual impact of the top 8 neural network features on output magnitude is shown. The x-axis represents the Shapley value for each feature, and the y-axis indicates the names of the neural network’s input features.</w:t>
       </w:r>
     </w:p>
     <w:p>
@@ -11791,7 +11579,13 @@
         <w:ind w:left="174" w:right="106" w:firstLine="170"/>
       </w:pPr>
       <w:r>
-        <w:t xml:space="preserve">Regarding individual patient feature importance (Figure </w:t>
+        <w:rPr>
+          <w:rFonts w:hint="eastAsia"/>
+        </w:rPr>
+        <w:t>With respect to individual patient feature importance</w:t>
+      </w:r>
+      <w:r>
+        <w:t xml:space="preserve">(Figure </w:t>
       </w:r>
       <w:r>
         <w:fldChar w:fldCharType="begin"/>
@@ -11809,7 +11603,16 @@
         <w:fldChar w:fldCharType="end"/>
       </w:r>
       <w:r>
-        <w:t xml:space="preserve">we randomly selected one patient(HER2- positive, female, metastasis at </w:t>
+        <w:t>one</w:t>
+      </w:r>
+      <w:r>
+        <w:rPr>
+          <w:rFonts w:hint="eastAsia"/>
+        </w:rPr>
+        <w:t xml:space="preserve"> patient was selected at random</w:t>
+      </w:r>
+      <w:r>
+        <w:t xml:space="preserve">(HER2- positive, female, metastasis at </w:t>
       </w:r>
       <w:r>
         <w:rPr>
@@ -11818,25 +11621,27 @@
         <w:t xml:space="preserve">liver, </w:t>
       </w:r>
       <w:r>
-        <w:t xml:space="preserve">didn’t received surgery) from our testing dataset to show </w:t>
-      </w:r>
-      <w:r>
-        <w:rPr>
-          <w:spacing w:val="-3"/>
-        </w:rPr>
-        <w:t xml:space="preserve">how </w:t>
-      </w:r>
-      <w:r>
-        <w:t>the model</w:t>
-      </w:r>
-      <w:r>
-        <w:rPr>
-          <w:spacing w:val="-12"/>
-        </w:rPr>
-        <w:t xml:space="preserve"> </w:t>
-      </w:r>
-      <w:r>
-        <w:t>arrives</w:t>
+        <w:t>didn’t received surgery) from our testing dataset</w:t>
+      </w:r>
+      <w:r>
+        <w:rPr>
+          <w:rFonts w:hint="eastAsia" w:eastAsia="宋体"/>
+          <w:lang w:val="en-US" w:eastAsia="zh-CN"/>
+        </w:rPr>
+        <w:t xml:space="preserve"> </w:t>
+      </w:r>
+      <w:r>
+        <w:rPr>
+          <w:rFonts w:hint="eastAsia"/>
+        </w:rPr>
+        <w:t>to demonstrate how the model starts with an initial log-partial hazard of zero</w:t>
+      </w:r>
+      <w:r>
+        <w:rPr>
+          <w:rFonts w:hint="eastAsia" w:eastAsia="宋体"/>
+          <w:lang w:val="en-US" w:eastAsia="zh-CN"/>
+        </w:rPr>
+        <w:t>,</w:t>
       </w:r>
       <w:r>
         <w:rPr>
@@ -11845,193 +11650,23 @@
         <w:t xml:space="preserve"> </w:t>
       </w:r>
       <w:r>
-        <w:t>at</w:t>
-      </w:r>
-      <w:r>
-        <w:rPr>
+        <w:rPr>
+          <w:rFonts w:hint="eastAsia"/>
           <w:spacing w:val="-11"/>
         </w:rPr>
-        <w:t xml:space="preserve"> </w:t>
-      </w:r>
-      <w:r>
-        <w:t>the</w:t>
-      </w:r>
-      <w:r>
-        <w:rPr>
-          <w:spacing w:val="-11"/>
-        </w:rPr>
-        <w:t xml:space="preserve"> </w:t>
-      </w:r>
-      <w:r>
-        <w:t>beginning</w:t>
-      </w:r>
-      <w:r>
-        <w:rPr>
-          <w:spacing w:val="-12"/>
-        </w:rPr>
-        <w:t xml:space="preserve"> </w:t>
-      </w:r>
-      <w:r>
-        <w:t>log-partial</w:t>
-      </w:r>
-      <w:r>
-        <w:rPr>
-          <w:spacing w:val="-11"/>
-        </w:rPr>
-        <w:t xml:space="preserve"> </w:t>
-      </w:r>
-      <w:r>
-        <w:t>hazard(0)</w:t>
-      </w:r>
-      <w:r>
-        <w:rPr>
-          <w:spacing w:val="-11"/>
-        </w:rPr>
-        <w:t xml:space="preserve"> </w:t>
-      </w:r>
-      <w:r>
-        <w:t>when</w:t>
-      </w:r>
-      <w:r>
-        <w:rPr>
-          <w:spacing w:val="-11"/>
-        </w:rPr>
-        <w:t xml:space="preserve"> </w:t>
-      </w:r>
-      <w:r>
-        <w:t>it</w:t>
-      </w:r>
-      <w:r>
-        <w:rPr>
-          <w:spacing w:val="-12"/>
-        </w:rPr>
-        <w:t xml:space="preserve"> </w:t>
-      </w:r>
-      <w:r>
-        <w:t>has</w:t>
-      </w:r>
-      <w:r>
-        <w:rPr>
-          <w:spacing w:val="-11"/>
-        </w:rPr>
-        <w:t xml:space="preserve"> </w:t>
-      </w:r>
-      <w:r>
-        <w:t>no</w:t>
-      </w:r>
-      <w:r>
-        <w:rPr>
-          <w:spacing w:val="-11"/>
-        </w:rPr>
-        <w:t xml:space="preserve"> </w:t>
-      </w:r>
-      <w:r>
-        <w:t>prior</w:t>
-      </w:r>
-      <w:r>
-        <w:rPr>
-          <w:spacing w:val="-12"/>
-        </w:rPr>
-        <w:t xml:space="preserve"> </w:t>
-      </w:r>
-      <w:r>
-        <w:t>knowledge</w:t>
-      </w:r>
-      <w:r>
-        <w:rPr>
-          <w:spacing w:val="-11"/>
-        </w:rPr>
-        <w:t xml:space="preserve"> </w:t>
-      </w:r>
-      <w:r>
-        <w:t>of</w:t>
-      </w:r>
-      <w:r>
-        <w:rPr>
-          <w:spacing w:val="-12"/>
-        </w:rPr>
-        <w:t xml:space="preserve"> </w:t>
-      </w:r>
-      <w:r>
-        <w:t>the</w:t>
-      </w:r>
-      <w:r>
-        <w:rPr>
-          <w:spacing w:val="-11"/>
-        </w:rPr>
-        <w:t xml:space="preserve"> </w:t>
-      </w:r>
-      <w:r>
-        <w:t>patient</w:t>
-      </w:r>
-      <w:r>
-        <w:rPr>
-          <w:spacing w:val="-11"/>
-        </w:rPr>
-        <w:t xml:space="preserve"> </w:t>
-      </w:r>
-      <w:r>
-        <w:t>and</w:t>
-      </w:r>
-      <w:r>
-        <w:rPr>
-          <w:spacing w:val="-11"/>
-        </w:rPr>
-        <w:t xml:space="preserve"> </w:t>
-      </w:r>
-      <w:r>
-        <w:rPr>
-          <w:spacing w:val="-3"/>
-        </w:rPr>
-        <w:t xml:space="preserve">how </w:t>
-      </w:r>
-      <w:r>
-        <w:t>it predicts the patient’s outcome.(0.493). At first, all the other insignificant 144 features initially increase the</w:t>
-      </w:r>
-      <w:r>
-        <w:rPr>
-          <w:spacing w:val="-4"/>
-        </w:rPr>
-        <w:t xml:space="preserve"> </w:t>
-      </w:r>
-      <w:r>
-        <w:t>log</w:t>
-      </w:r>
-      <w:r>
-        <w:rPr>
-          <w:spacing w:val="-3"/>
-        </w:rPr>
-        <w:t xml:space="preserve"> </w:t>
-      </w:r>
-      <w:r>
-        <w:t>hazard</w:t>
-      </w:r>
-      <w:r>
-        <w:rPr>
-          <w:spacing w:val="-3"/>
-        </w:rPr>
-        <w:t xml:space="preserve"> </w:t>
-      </w:r>
-      <w:r>
-        <w:t>risk</w:t>
-      </w:r>
-      <w:r>
-        <w:rPr>
-          <w:spacing w:val="-4"/>
-        </w:rPr>
-        <w:t xml:space="preserve"> </w:t>
-      </w:r>
-      <w:r>
-        <w:t>by</w:t>
-      </w:r>
-      <w:r>
-        <w:rPr>
-          <w:spacing w:val="-2"/>
-        </w:rPr>
-        <w:t xml:space="preserve"> </w:t>
-      </w:r>
-      <w:r>
-        <w:t>0.14.</w:t>
+        <w:t>reflecting no prior knowledge about the patient, and subsequently predicts the patient’s outcome</w:t>
+      </w:r>
+      <w:r>
+        <w:t xml:space="preserve">.(0.493). </w:t>
+      </w:r>
+      <w:r>
+        <w:rPr>
+          <w:rFonts w:hint="eastAsia"/>
+        </w:rPr>
+        <w:t>Initially, the combined effect of the 144 insignificant features raises the log hazard risk by 0.14</w:t>
+      </w:r>
+      <w:r>
+        <w:t>.</w:t>
       </w:r>
       <w:r>
         <w:rPr>
@@ -12661,7 +12296,16 @@
         <w:ind w:left="168" w:right="146" w:firstLine="176"/>
       </w:pPr>
       <w:r>
-        <w:t>The different sites for metastasis may lead to the worse OS(</w:t>
+        <w:t xml:space="preserve">The different sites for metastasis may </w:t>
+      </w:r>
+      <w:r>
+        <w:rPr>
+          <w:rFonts w:hint="eastAsia"/>
+        </w:rPr>
+        <w:t xml:space="preserve"> result in</w:t>
+      </w:r>
+      <w:r>
+        <w:t xml:space="preserve"> the worse OS(</w:t>
       </w:r>
       <w:r>
         <w:fldChar w:fldCharType="begin"/>
@@ -12697,7 +12341,16 @@
         <w:fldChar w:fldCharType="end"/>
       </w:r>
       <w:r>
-        <w:t>), so we compared the OS between surgery</w:t>
+        <w:t xml:space="preserve">), </w:t>
+      </w:r>
+      <w:r>
+        <w:rPr>
+          <w:rFonts w:hint="eastAsia"/>
+        </w:rPr>
+        <w:t>Consequently, OS was compared</w:t>
+      </w:r>
+      <w:r>
+        <w:t xml:space="preserve"> between surgery</w:t>
       </w:r>
       <w:r>
         <w:rPr>
@@ -12862,16 +12515,20 @@
         <w:t xml:space="preserve"> </w:t>
       </w:r>
       <w:r>
-        <w:t>has</w:t>
-      </w:r>
-      <w:r>
-        <w:rPr>
+        <w:rPr>
+          <w:rFonts w:hint="eastAsia"/>
           <w:spacing w:val="-3"/>
         </w:rPr>
-        <w:t xml:space="preserve"> </w:t>
-      </w:r>
-      <w:r>
-        <w:t>better</w:t>
+        <w:t>has a higher overall survival rate than patients</w:t>
+      </w:r>
+      <w:r>
+        <w:rPr>
+          <w:spacing w:val="-2"/>
+        </w:rPr>
+        <w:t xml:space="preserve"> </w:t>
+      </w:r>
+      <w:r>
+        <w:t>without</w:t>
       </w:r>
       <w:r>
         <w:rPr>
@@ -12880,6 +12537,24 @@
         <w:t xml:space="preserve"> </w:t>
       </w:r>
       <w:r>
+        <w:t>Surgery:</w:t>
+      </w:r>
+      <w:r>
+        <w:rPr>
+          <w:spacing w:val="-3"/>
+        </w:rPr>
+        <w:t xml:space="preserve"> </w:t>
+      </w:r>
+      <w:r>
+        <w:t>5-year</w:t>
+      </w:r>
+      <w:r>
+        <w:rPr>
+          <w:spacing w:val="-3"/>
+        </w:rPr>
+        <w:t xml:space="preserve"> </w:t>
+      </w:r>
+      <w:r>
         <w:t>OS</w:t>
       </w:r>
       <w:r>
@@ -12889,7 +12564,7 @@
         <w:t xml:space="preserve"> </w:t>
       </w:r>
       <w:r>
-        <w:t>than</w:t>
+        <w:t>rates</w:t>
       </w:r>
       <w:r>
         <w:rPr>
@@ -12898,16 +12573,7 @@
         <w:t xml:space="preserve"> </w:t>
       </w:r>
       <w:r>
-        <w:t>patients</w:t>
-      </w:r>
-      <w:r>
-        <w:rPr>
-          <w:spacing w:val="-2"/>
-        </w:rPr>
-        <w:t xml:space="preserve"> </w:t>
-      </w:r>
-      <w:r>
-        <w:t>without</w:t>
+        <w:t>of</w:t>
       </w:r>
       <w:r>
         <w:rPr>
@@ -12916,11 +12582,134 @@
         <w:t xml:space="preserve"> </w:t>
       </w:r>
       <w:r>
-        <w:t>Surgery:</w:t>
-      </w:r>
-      <w:r>
-        <w:rPr>
-          <w:spacing w:val="-3"/>
+        <w:t>76.9 versus</w:t>
+      </w:r>
+      <w:r>
+        <w:rPr>
+          <w:spacing w:val="-19"/>
+        </w:rPr>
+        <w:t xml:space="preserve"> </w:t>
+      </w:r>
+      <w:r>
+        <w:t>27.2%</w:t>
+      </w:r>
+      <w:r>
+        <w:rPr>
+          <w:spacing w:val="-19"/>
+        </w:rPr>
+        <w:t xml:space="preserve"> </w:t>
+      </w:r>
+      <w:r>
+        <w:t>(surgery</w:t>
+      </w:r>
+      <w:r>
+        <w:rPr>
+          <w:spacing w:val="-19"/>
+        </w:rPr>
+        <w:t xml:space="preserve"> </w:t>
+      </w:r>
+      <w:r>
+        <w:t>vs.</w:t>
+      </w:r>
+      <w:r>
+        <w:rPr>
+          <w:spacing w:val="-18"/>
+        </w:rPr>
+        <w:t xml:space="preserve"> </w:t>
+      </w:r>
+      <w:r>
+        <w:t>non-surgery,</w:t>
+      </w:r>
+      <w:r>
+        <w:rPr>
+          <w:spacing w:val="-18"/>
+        </w:rPr>
+        <w:t xml:space="preserve"> </w:t>
+      </w:r>
+      <w:r>
+        <w:t>P</w:t>
+      </w:r>
+      <w:r>
+        <w:rPr>
+          <w:spacing w:val="-18"/>
+        </w:rPr>
+        <w:t xml:space="preserve"> </w:t>
+      </w:r>
+      <w:r>
+        <w:t>=</w:t>
+      </w:r>
+      <w:r>
+        <w:rPr>
+          <w:spacing w:val="-19"/>
+        </w:rPr>
+        <w:t xml:space="preserve"> </w:t>
+      </w:r>
+      <w:r>
+        <w:t>0.035;</w:t>
+      </w:r>
+      <w:r>
+        <w:rPr>
+          <w:spacing w:val="-17"/>
+        </w:rPr>
+        <w:t xml:space="preserve"> </w:t>
+      </w:r>
+      <w:r>
+        <w:t>Figure</w:t>
+      </w:r>
+      <w:r>
+        <w:rPr>
+          <w:spacing w:val="-19"/>
+        </w:rPr>
+        <w:t xml:space="preserve"> </w:t>
+      </w:r>
+      <w:r>
+        <w:fldChar w:fldCharType="begin"/>
+      </w:r>
+      <w:r>
+        <w:instrText xml:space="preserve"> HYPERLINK \l "_bookmark4" </w:instrText>
+      </w:r>
+      <w:r>
+        <w:fldChar w:fldCharType="separate"/>
+      </w:r>
+      <w:r>
+        <w:t>4A).</w:t>
+      </w:r>
+      <w:r>
+        <w:rPr>
+          <w:spacing w:val="-19"/>
+        </w:rPr>
+        <w:t xml:space="preserve"> </w:t>
+      </w:r>
+      <w:r>
+        <w:rPr>
+          <w:spacing w:val="-19"/>
+        </w:rPr>
+        <w:fldChar w:fldCharType="end"/>
+      </w:r>
+      <w:r>
+        <w:t>In</w:t>
+      </w:r>
+      <w:r>
+        <w:rPr>
+          <w:spacing w:val="-19"/>
+        </w:rPr>
+        <w:t xml:space="preserve"> </w:t>
+      </w:r>
+      <w:r>
+        <w:t>Brain</w:t>
+      </w:r>
+      <w:r>
+        <w:rPr>
+          <w:spacing w:val="-18"/>
+        </w:rPr>
+        <w:t xml:space="preserve"> </w:t>
+      </w:r>
+      <w:r>
+        <w:t>settings,</w:t>
+      </w:r>
+      <w:r>
+        <w:rPr>
+          <w:spacing w:val="-18"/>
         </w:rPr>
         <w:t xml:space="preserve"> </w:t>
       </w:r>
@@ -12929,7 +12718,7 @@
       </w:r>
       <w:r>
         <w:rPr>
-          <w:spacing w:val="-3"/>
+          <w:spacing w:val="-19"/>
         </w:rPr>
         <w:t xml:space="preserve"> </w:t>
       </w:r>
@@ -12938,7 +12727,7 @@
       </w:r>
       <w:r>
         <w:rPr>
-          <w:spacing w:val="-3"/>
+          <w:spacing w:val="-19"/>
         </w:rPr>
         <w:t xml:space="preserve"> </w:t>
       </w:r>
@@ -12947,7 +12736,7 @@
       </w:r>
       <w:r>
         <w:rPr>
-          <w:spacing w:val="-3"/>
+          <w:spacing w:val="-18"/>
         </w:rPr>
         <w:t xml:space="preserve"> </w:t>
       </w:r>
@@ -12956,21 +12745,12 @@
       </w:r>
       <w:r>
         <w:rPr>
-          <w:spacing w:val="-3"/>
-        </w:rPr>
-        <w:t xml:space="preserve"> </w:t>
-      </w:r>
-      <w:r>
-        <w:t>76.9 versus</w:t>
-      </w:r>
-      <w:r>
-        <w:rPr>
           <w:spacing w:val="-19"/>
         </w:rPr>
         <w:t xml:space="preserve"> </w:t>
       </w:r>
       <w:r>
-        <w:t>27.2%</w:t>
+        <w:t>0</w:t>
       </w:r>
       <w:r>
         <w:rPr>
@@ -12979,11 +12759,20 @@
         <w:t xml:space="preserve"> </w:t>
       </w:r>
       <w:r>
+        <w:t>versus 0%</w:t>
+      </w:r>
+      <w:r>
+        <w:rPr>
+          <w:spacing w:val="-6"/>
+        </w:rPr>
+        <w:t xml:space="preserve"> </w:t>
+      </w:r>
+      <w:r>
         <w:t>(surgery</w:t>
       </w:r>
       <w:r>
         <w:rPr>
-          <w:spacing w:val="-19"/>
+          <w:spacing w:val="-6"/>
         </w:rPr>
         <w:t xml:space="preserve"> </w:t>
       </w:r>
@@ -12992,7 +12781,7 @@
       </w:r>
       <w:r>
         <w:rPr>
-          <w:spacing w:val="-18"/>
+          <w:spacing w:val="-6"/>
         </w:rPr>
         <w:t xml:space="preserve"> </w:t>
       </w:r>
@@ -13001,7 +12790,7 @@
       </w:r>
       <w:r>
         <w:rPr>
-          <w:spacing w:val="-18"/>
+          <w:spacing w:val="-5"/>
         </w:rPr>
         <w:t xml:space="preserve"> </w:t>
       </w:r>
@@ -13010,7 +12799,7 @@
       </w:r>
       <w:r>
         <w:rPr>
-          <w:spacing w:val="-18"/>
+          <w:spacing w:val="-6"/>
         </w:rPr>
         <w:t xml:space="preserve"> </w:t>
       </w:r>
@@ -13019,16 +12808,16 @@
       </w:r>
       <w:r>
         <w:rPr>
-          <w:spacing w:val="-19"/>
-        </w:rPr>
-        <w:t xml:space="preserve"> </w:t>
-      </w:r>
-      <w:r>
-        <w:t>0.035;</w:t>
-      </w:r>
-      <w:r>
-        <w:rPr>
-          <w:spacing w:val="-17"/>
+          <w:spacing w:val="-6"/>
+        </w:rPr>
+        <w:t xml:space="preserve"> </w:t>
+      </w:r>
+      <w:r>
+        <w:t>0.239;</w:t>
+      </w:r>
+      <w:r>
+        <w:rPr>
+          <w:spacing w:val="-5"/>
         </w:rPr>
         <w:t xml:space="preserve"> </w:t>
       </w:r>
@@ -13037,7 +12826,7 @@
       </w:r>
       <w:r>
         <w:rPr>
-          <w:spacing w:val="-19"/>
+          <w:spacing w:val="-6"/>
         </w:rPr>
         <w:t xml:space="preserve"> </w:t>
       </w:r>
@@ -13051,53 +12840,53 @@
         <w:fldChar w:fldCharType="separate"/>
       </w:r>
       <w:r>
-        <w:t>4A).</w:t>
-      </w:r>
-      <w:r>
-        <w:rPr>
-          <w:spacing w:val="-19"/>
-        </w:rPr>
-        <w:t xml:space="preserve"> </w:t>
-      </w:r>
-      <w:r>
-        <w:rPr>
-          <w:spacing w:val="-19"/>
+        <w:t>4B),</w:t>
+      </w:r>
+      <w:r>
+        <w:rPr>
+          <w:spacing w:val="-6"/>
+        </w:rPr>
+        <w:t xml:space="preserve"> </w:t>
+      </w:r>
+      <w:r>
+        <w:rPr>
+          <w:spacing w:val="-6"/>
         </w:rPr>
         <w:fldChar w:fldCharType="end"/>
       </w:r>
       <w:r>
-        <w:t>In</w:t>
-      </w:r>
-      <w:r>
-        <w:rPr>
-          <w:spacing w:val="-19"/>
-        </w:rPr>
-        <w:t xml:space="preserve"> </w:t>
-      </w:r>
-      <w:r>
-        <w:t>Brain</w:t>
-      </w:r>
-      <w:r>
-        <w:rPr>
-          <w:spacing w:val="-18"/>
-        </w:rPr>
-        <w:t xml:space="preserve"> </w:t>
-      </w:r>
-      <w:r>
-        <w:t>settings,</w:t>
-      </w:r>
-      <w:r>
-        <w:rPr>
-          <w:spacing w:val="-18"/>
-        </w:rPr>
-        <w:t xml:space="preserve"> </w:t>
-      </w:r>
-      <w:r>
-        <w:t>5-year</w:t>
-      </w:r>
-      <w:r>
-        <w:rPr>
-          <w:spacing w:val="-19"/>
+        <w:t>in</w:t>
+      </w:r>
+      <w:r>
+        <w:rPr>
+          <w:spacing w:val="-5"/>
+        </w:rPr>
+        <w:t xml:space="preserve"> </w:t>
+      </w:r>
+      <w:r>
+        <w:t>three</w:t>
+      </w:r>
+      <w:r>
+        <w:rPr>
+          <w:spacing w:val="-6"/>
+        </w:rPr>
+        <w:t xml:space="preserve"> </w:t>
+      </w:r>
+      <w:r>
+        <w:t>Lung</w:t>
+      </w:r>
+      <w:r>
+        <w:rPr>
+          <w:spacing w:val="-6"/>
+        </w:rPr>
+        <w:t xml:space="preserve"> </w:t>
+      </w:r>
+      <w:r>
+        <w:t>settings,5-year</w:t>
+      </w:r>
+      <w:r>
+        <w:rPr>
+          <w:spacing w:val="-5"/>
         </w:rPr>
         <w:t xml:space="preserve"> </w:t>
       </w:r>
@@ -13106,7 +12895,7 @@
       </w:r>
       <w:r>
         <w:rPr>
-          <w:spacing w:val="-19"/>
+          <w:spacing w:val="-6"/>
         </w:rPr>
         <w:t xml:space="preserve"> </w:t>
       </w:r>
@@ -13115,7 +12904,7 @@
       </w:r>
       <w:r>
         <w:rPr>
-          <w:spacing w:val="-18"/>
+          <w:spacing w:val="-6"/>
         </w:rPr>
         <w:t xml:space="preserve"> </w:t>
       </w:r>
@@ -13124,21 +12913,12 @@
       </w:r>
       <w:r>
         <w:rPr>
-          <w:spacing w:val="-19"/>
-        </w:rPr>
-        <w:t xml:space="preserve"> </w:t>
-      </w:r>
-      <w:r>
-        <w:t>0</w:t>
-      </w:r>
-      <w:r>
-        <w:rPr>
-          <w:spacing w:val="-19"/>
-        </w:rPr>
-        <w:t xml:space="preserve"> </w:t>
-      </w:r>
-      <w:r>
-        <w:t>versus 0%</w:t>
+          <w:spacing w:val="-5"/>
+        </w:rPr>
+        <w:t xml:space="preserve"> </w:t>
+      </w:r>
+      <w:r>
+        <w:t>61.1</w:t>
       </w:r>
       <w:r>
         <w:rPr>
@@ -13147,11 +12927,20 @@
         <w:t xml:space="preserve"> </w:t>
       </w:r>
       <w:r>
+        <w:t>versus 28.3%</w:t>
+      </w:r>
+      <w:r>
+        <w:rPr>
+          <w:spacing w:val="-10"/>
+        </w:rPr>
+        <w:t xml:space="preserve"> </w:t>
+      </w:r>
+      <w:r>
         <w:t>(surgery</w:t>
       </w:r>
       <w:r>
         <w:rPr>
-          <w:spacing w:val="-6"/>
+          <w:spacing w:val="-9"/>
         </w:rPr>
         <w:t xml:space="preserve"> </w:t>
       </w:r>
@@ -13160,7 +12949,7 @@
       </w:r>
       <w:r>
         <w:rPr>
-          <w:spacing w:val="-6"/>
+          <w:spacing w:val="-9"/>
         </w:rPr>
         <w:t xml:space="preserve"> </w:t>
       </w:r>
@@ -13169,7 +12958,7 @@
       </w:r>
       <w:r>
         <w:rPr>
-          <w:spacing w:val="-5"/>
+          <w:spacing w:val="-9"/>
         </w:rPr>
         <w:t xml:space="preserve"> </w:t>
       </w:r>
@@ -13178,7 +12967,7 @@
       </w:r>
       <w:r>
         <w:rPr>
-          <w:spacing w:val="-6"/>
+          <w:spacing w:val="-9"/>
         </w:rPr>
         <w:t xml:space="preserve"> </w:t>
       </w:r>
@@ -13187,16 +12976,16 @@
       </w:r>
       <w:r>
         <w:rPr>
-          <w:spacing w:val="-6"/>
-        </w:rPr>
-        <w:t xml:space="preserve"> </w:t>
-      </w:r>
-      <w:r>
-        <w:t>0.239;</w:t>
-      </w:r>
-      <w:r>
-        <w:rPr>
-          <w:spacing w:val="-5"/>
+          <w:spacing w:val="-9"/>
+        </w:rPr>
+        <w:t xml:space="preserve"> </w:t>
+      </w:r>
+      <w:r>
+        <w:t>0.283;</w:t>
+      </w:r>
+      <w:r>
+        <w:rPr>
+          <w:spacing w:val="-9"/>
         </w:rPr>
         <w:t xml:space="preserve"> </w:t>
       </w:r>
@@ -13205,7 +12994,7 @@
       </w:r>
       <w:r>
         <w:rPr>
-          <w:spacing w:val="-6"/>
+          <w:spacing w:val="-9"/>
         </w:rPr>
         <w:t xml:space="preserve"> </w:t>
       </w:r>
@@ -13219,175 +13008,17 @@
         <w:fldChar w:fldCharType="separate"/>
       </w:r>
       <w:r>
-        <w:t>4B),</w:t>
-      </w:r>
-      <w:r>
-        <w:rPr>
-          <w:spacing w:val="-6"/>
-        </w:rPr>
-        <w:t xml:space="preserve"> </w:t>
-      </w:r>
-      <w:r>
-        <w:rPr>
-          <w:spacing w:val="-6"/>
-        </w:rPr>
-        <w:fldChar w:fldCharType="end"/>
-      </w:r>
-      <w:r>
-        <w:t>in</w:t>
-      </w:r>
-      <w:r>
-        <w:rPr>
-          <w:spacing w:val="-5"/>
-        </w:rPr>
-        <w:t xml:space="preserve"> </w:t>
-      </w:r>
-      <w:r>
-        <w:t>three</w:t>
-      </w:r>
-      <w:r>
-        <w:rPr>
-          <w:spacing w:val="-6"/>
-        </w:rPr>
-        <w:t xml:space="preserve"> </w:t>
-      </w:r>
-      <w:r>
-        <w:t>Lung</w:t>
-      </w:r>
-      <w:r>
-        <w:rPr>
-          <w:spacing w:val="-6"/>
-        </w:rPr>
-        <w:t xml:space="preserve"> </w:t>
-      </w:r>
-      <w:r>
-        <w:t>settings,5-year</w:t>
-      </w:r>
-      <w:r>
-        <w:rPr>
-          <w:spacing w:val="-5"/>
-        </w:rPr>
-        <w:t xml:space="preserve"> </w:t>
-      </w:r>
-      <w:r>
-        <w:t>OS</w:t>
-      </w:r>
-      <w:r>
-        <w:rPr>
-          <w:spacing w:val="-6"/>
-        </w:rPr>
-        <w:t xml:space="preserve"> </w:t>
-      </w:r>
-      <w:r>
-        <w:t>rates</w:t>
-      </w:r>
-      <w:r>
-        <w:rPr>
-          <w:spacing w:val="-6"/>
-        </w:rPr>
-        <w:t xml:space="preserve"> </w:t>
-      </w:r>
-      <w:r>
-        <w:t>of</w:t>
-      </w:r>
-      <w:r>
-        <w:rPr>
-          <w:spacing w:val="-5"/>
-        </w:rPr>
-        <w:t xml:space="preserve"> </w:t>
-      </w:r>
-      <w:r>
-        <w:t>61.1</w:t>
-      </w:r>
-      <w:r>
-        <w:rPr>
-          <w:spacing w:val="-6"/>
-        </w:rPr>
-        <w:t xml:space="preserve"> </w:t>
-      </w:r>
-      <w:r>
-        <w:t>versus 28.3%</w:t>
-      </w:r>
-      <w:r>
-        <w:rPr>
-          <w:spacing w:val="-10"/>
-        </w:rPr>
-        <w:t xml:space="preserve"> </w:t>
-      </w:r>
-      <w:r>
-        <w:t>(surgery</w:t>
-      </w:r>
-      <w:r>
-        <w:rPr>
-          <w:spacing w:val="-9"/>
-        </w:rPr>
-        <w:t xml:space="preserve"> </w:t>
-      </w:r>
-      <w:r>
-        <w:t>vs.</w:t>
-      </w:r>
-      <w:r>
-        <w:rPr>
-          <w:spacing w:val="-9"/>
-        </w:rPr>
-        <w:t xml:space="preserve"> </w:t>
-      </w:r>
-      <w:r>
-        <w:t>non-surgery,</w:t>
-      </w:r>
-      <w:r>
-        <w:rPr>
-          <w:spacing w:val="-9"/>
-        </w:rPr>
-        <w:t xml:space="preserve"> </w:t>
-      </w:r>
-      <w:r>
-        <w:t>P</w:t>
-      </w:r>
-      <w:r>
-        <w:rPr>
-          <w:spacing w:val="-9"/>
-        </w:rPr>
-        <w:t xml:space="preserve"> </w:t>
-      </w:r>
-      <w:r>
-        <w:t>=</w:t>
-      </w:r>
-      <w:r>
-        <w:rPr>
-          <w:spacing w:val="-9"/>
-        </w:rPr>
-        <w:t xml:space="preserve"> </w:t>
-      </w:r>
-      <w:r>
-        <w:t>0.283;</w:t>
-      </w:r>
-      <w:r>
-        <w:rPr>
-          <w:spacing w:val="-9"/>
-        </w:rPr>
-        <w:t xml:space="preserve"> </w:t>
-      </w:r>
-      <w:r>
-        <w:t>Figure</w:t>
-      </w:r>
-      <w:r>
-        <w:rPr>
-          <w:spacing w:val="-9"/>
-        </w:rPr>
-        <w:t xml:space="preserve"> </w:t>
-      </w:r>
-      <w:r>
-        <w:fldChar w:fldCharType="begin"/>
-      </w:r>
-      <w:r>
-        <w:instrText xml:space="preserve"> HYPERLINK \l "_bookmark4" </w:instrText>
-      </w:r>
-      <w:r>
-        <w:fldChar w:fldCharType="separate"/>
-      </w:r>
-      <w:r>
-        <w:t>4C)and</w:t>
+        <w:t>4C)</w:t>
+      </w:r>
+      <w:r>
+        <w:rPr>
+          <w:rFonts w:hint="eastAsia" w:eastAsia="宋体"/>
+          <w:lang w:val="en-US" w:eastAsia="zh-CN"/>
+        </w:rPr>
+        <w:t xml:space="preserve"> </w:t>
+      </w:r>
+      <w:r>
+        <w:t>and</w:t>
       </w:r>
       <w:r>
         <w:rPr>
@@ -13667,7 +13298,39 @@
         <w:fldChar w:fldCharType="end"/>
       </w:r>
       <w:r>
-        <w:t>and there is no significant difference of survival in all patients. On the contrary, For non-triple-negative patients, the difference is fairly large between the surgery</w:t>
+        <w:t xml:space="preserve">and </w:t>
+      </w:r>
+      <w:r>
+        <w:rPr>
+          <w:rFonts w:hint="eastAsia" w:eastAsia="宋体"/>
+          <w:lang w:val="en-US" w:eastAsia="zh-CN"/>
+        </w:rPr>
+        <w:t>s</w:t>
+      </w:r>
+      <w:r>
+        <w:rPr>
+          <w:rFonts w:hint="eastAsia"/>
+        </w:rPr>
+        <w:t>urvival did not differ significantly among the entire patient cohort.</w:t>
+      </w:r>
+      <w:r>
+        <w:t xml:space="preserve">. On the contrary, For non-triple-negative patients, </w:t>
+      </w:r>
+      <w:r>
+        <w:rPr>
+          <w:rFonts w:hint="eastAsia" w:eastAsia="宋体"/>
+          <w:lang w:val="en-US" w:eastAsia="zh-CN"/>
+        </w:rPr>
+        <w:t>t</w:t>
+      </w:r>
+      <w:r>
+        <w:rPr>
+          <w:rFonts w:hint="eastAsia"/>
+        </w:rPr>
+        <w:t>here is a considerable difference between</w:t>
+      </w:r>
+      <w:r>
+        <w:t xml:space="preserve"> the surgery</w:t>
       </w:r>
       <w:r>
         <w:rPr>
@@ -14347,7 +14010,7 @@
         <w:rPr>
           <w:rFonts w:hint="eastAsia"/>
         </w:rPr>
-        <w:t>The final deep learning model comprises five hidden layers with 10, 24, 47, and 22 neurons, respectively, and dropout layers inserted between them. The model was trained with a learning rate of 0.00601 and a dropout rate of 0.736. Throughout the training process, the loss curves for both the training and validation sets steadily declined. After 96 epochs, the validation loss plateaued at 6.0229, while the training loss continued to decrease from 5.1683. To prevent overfitting, training was halted at this point, and the model was preserved for testing.For comparison, the Cox proportional hazards model was implemented with a penalizer of 0.002 and a learning rate of 0.002. The deep learning model achieved a mean concordance index of 0.771, significantly outperforming the Cox model’s 0.632 (Table 2). Overall, the deep learning model demonstrated superior predictive performance (0.782 vs. 0.650).</w:t>
+        <w:t>The final deep learning model comprises five hidden layers with 10, 24, 47, and 22 neurons, respectively, and dropout layers inserted between them. The model was trained with a learning rate of 0.00601 and a dropout rate of 0.736. Throughout the training process, the loss curves for both the training and validation sets steadily declined. After 96 epochs, the validation loss plateaued at 6.0229, while the training loss continued to decrease from 5.1683. To avoid overfitting, training was halted at this point, and the model was preserved for testing.For comparison, the Cox proportional hazards model was implemented with a penalizer of 0.002 and a learning rate of 0.002. The deep learning model achieved a mean concordance index of 0.771, significantly outperforming the Cox model’s 0.632 (Table 2). Overall, the deep learning model demonstrated superior predictive performance (0.782 vs. 0.650).</w:t>
       </w:r>
       <w:r>
         <w:rPr>
@@ -14803,10 +14466,16 @@
       </w:r>
       <w:r>
         <w:rPr>
+          <w:rFonts w:hint="eastAsia"/>
+        </w:rPr>
+        <w:t>This study sought to resolve the ongoing debate</w:t>
+      </w:r>
+      <w:r>
+        <w:rPr>
           <w:rFonts w:hint="eastAsia" w:eastAsia="宋体"/>
           <w:lang w:val="en-US" w:eastAsia="zh-CN"/>
         </w:rPr>
-        <w:t>This study aimed to address the ongoing debate surrounding the potential benefits of local therapy for patients with stage IV breast cancer who have already received systemic treatment. Our findings suggest that patients with bone metastases may derive additional benefit from local therapy. In particular, local treatment is strongly recommended for patients with bone metastases who do not have triple-negative breast cancer. Beyond developing a highly accurate deep learning model, we also integrated an explainable module to elucidate how the model predicts outcomes based on the relative importance of clinical features. Using the model and training data, we identified the global feature importance influencing survival predictions. To the best of our knowledge, this represents the first explainable, data-driven framework to support local therapy decision-making for patients with stage IV breast cancer.</w:t>
+        <w:t xml:space="preserve"> surrounding the potential benefits of local therapy for patients with stage IV breast cancer who have already received systemic treatment. Our findings suggest that patients with bone metastases may derive additional benefit from local therapy. In particular, local treatment is strongly recommended for patients with bone metastases who do not have triple-negative breast cancer. Beyond developing A deep learning model with high accuracy, we also integrated a module for explainability that reveals how the model’s predictions are influenced by the relative significance of clinical features. Using the model and training data, we identified the global feature importance influencing survival predictions. To the best of our knowledge, this represents the first explainable, data-driven framework to support local therapy decision-making for patients with stage IV breast cancer.</w:t>
       </w:r>
       <w:r>
         <w:rPr>
@@ -16730,12 +16399,19 @@
       </w:r>
       <w:r>
         <w:rPr>
-          <w:spacing w:val="-33"/>
-        </w:rPr>
-        <w:t xml:space="preserve"> </w:t>
-      </w:r>
-      <w:r>
-        <w:t>subtype of</w:t>
+          <w:rFonts w:hint="eastAsia" w:eastAsia="宋体"/>
+          <w:lang w:val="en-US" w:eastAsia="zh-CN"/>
+        </w:rPr>
+        <w:t xml:space="preserve"> b</w:t>
+      </w:r>
+      <w:r>
+        <w:rPr>
+          <w:rFonts w:hint="eastAsia"/>
+        </w:rPr>
+        <w:t>reast cancer subtype is also a critical factor</w:t>
+      </w:r>
+      <w:r>
+        <w:t>.</w:t>
       </w:r>
       <w:r>
         <w:rPr>
@@ -16744,101 +16420,17 @@
         <w:t xml:space="preserve"> </w:t>
       </w:r>
       <w:r>
-        <w:t>breast</w:t>
-      </w:r>
-      <w:r>
-        <w:rPr>
+        <w:rPr>
+          <w:rFonts w:hint="eastAsia"/>
           <w:spacing w:val="-8"/>
         </w:rPr>
-        <w:t xml:space="preserve"> </w:t>
-      </w:r>
-      <w:r>
-        <w:t>cancer</w:t>
-      </w:r>
-      <w:r>
-        <w:rPr>
-          <w:spacing w:val="-7"/>
-        </w:rPr>
-        <w:t xml:space="preserve"> </w:t>
-      </w:r>
-      <w:r>
-        <w:t>also</w:t>
-      </w:r>
-      <w:r>
-        <w:rPr>
+        <w:t>Prior research has repeatedly confirmed</w:t>
+      </w:r>
+      <w:r>
+        <w:rPr>
+          <w:rFonts w:hint="eastAsia" w:eastAsia="宋体"/>
           <w:spacing w:val="-8"/>
-        </w:rPr>
-        <w:t xml:space="preserve"> </w:t>
-      </w:r>
-      <w:r>
-        <w:t>plays</w:t>
-      </w:r>
-      <w:r>
-        <w:rPr>
-          <w:spacing w:val="-7"/>
-        </w:rPr>
-        <w:t xml:space="preserve"> </w:t>
-      </w:r>
-      <w:r>
-        <w:t>a</w:t>
-      </w:r>
-      <w:r>
-        <w:rPr>
-          <w:spacing w:val="-8"/>
-        </w:rPr>
-        <w:t xml:space="preserve"> </w:t>
-      </w:r>
-      <w:r>
-        <w:t>crucial</w:t>
-      </w:r>
-      <w:r>
-        <w:rPr>
-          <w:spacing w:val="-7"/>
-        </w:rPr>
-        <w:t xml:space="preserve"> </w:t>
-      </w:r>
-      <w:r>
-        <w:t>role.</w:t>
-      </w:r>
-      <w:r>
-        <w:rPr>
-          <w:spacing w:val="-8"/>
-        </w:rPr>
-        <w:t xml:space="preserve"> </w:t>
-      </w:r>
-      <w:r>
-        <w:t>Existing</w:t>
-      </w:r>
-      <w:r>
-        <w:rPr>
-          <w:spacing w:val="-7"/>
-        </w:rPr>
-        <w:t xml:space="preserve"> </w:t>
-      </w:r>
-      <w:r>
-        <w:t>research</w:t>
-      </w:r>
-      <w:r>
-        <w:rPr>
-          <w:spacing w:val="-8"/>
-        </w:rPr>
-        <w:t xml:space="preserve"> </w:t>
-      </w:r>
-      <w:r>
-        <w:t>consistently</w:t>
-      </w:r>
-      <w:r>
-        <w:rPr>
-          <w:spacing w:val="-8"/>
-        </w:rPr>
-        <w:t xml:space="preserve"> </w:t>
-      </w:r>
-      <w:r>
-        <w:t>demonstrates</w:t>
-      </w:r>
-      <w:r>
-        <w:rPr>
-          <w:spacing w:val="-7"/>
+          <w:lang w:val="en-US" w:eastAsia="zh-CN"/>
         </w:rPr>
         <w:t xml:space="preserve"> </w:t>
       </w:r>
@@ -16887,573 +16479,454 @@
     <w:p>
       <w:pPr>
         <w:pStyle w:val="4"/>
-        <w:spacing w:before="97" w:line="259" w:lineRule="auto"/>
-        <w:ind w:left="128" w:right="184" w:hanging="9"/>
-      </w:pPr>
-      <w:r>
-        <w:t xml:space="preserve">were correlated with the choice of surgery type </w:t>
-      </w:r>
-      <w:r>
-        <w:fldChar w:fldCharType="begin"/>
-      </w:r>
-      <w:r>
-        <w:instrText xml:space="preserve"> HYPERLINK \l "_bookmark18" </w:instrText>
-      </w:r>
-      <w:r>
-        <w:fldChar w:fldCharType="separate"/>
-      </w:r>
-      <w:r>
-        <w:t xml:space="preserve">(12, </w:t>
-      </w:r>
-      <w:r>
-        <w:fldChar w:fldCharType="end"/>
-      </w:r>
-      <w:r>
-        <w:fldChar w:fldCharType="begin"/>
-      </w:r>
-      <w:r>
-        <w:instrText xml:space="preserve"> HYPERLINK \l "_bookmark19" </w:instrText>
-      </w:r>
-      <w:r>
-        <w:fldChar w:fldCharType="separate"/>
-      </w:r>
-      <w:r>
-        <w:t xml:space="preserve">13, </w:t>
-      </w:r>
-      <w:r>
-        <w:fldChar w:fldCharType="end"/>
-      </w:r>
-      <w:r>
-        <w:fldChar w:fldCharType="begin"/>
-      </w:r>
-      <w:r>
-        <w:instrText xml:space="preserve"> HYPERLINK \l "_bookmark25" </w:instrText>
-      </w:r>
-      <w:r>
-        <w:fldChar w:fldCharType="separate"/>
-      </w:r>
-      <w:r>
-        <w:t xml:space="preserve">19). </w:t>
-      </w:r>
-      <w:r>
-        <w:fldChar w:fldCharType="end"/>
-      </w:r>
-      <w:r>
-        <w:t>Luminal A and luminal B are linked to</w:t>
-      </w:r>
-      <w:r>
-        <w:rPr>
-          <w:spacing w:val="-43"/>
-        </w:rPr>
-        <w:t xml:space="preserve"> </w:t>
-      </w:r>
-      <w:r>
-        <w:t>good prognosis,</w:t>
-      </w:r>
-      <w:r>
-        <w:rPr>
-          <w:spacing w:val="-18"/>
-        </w:rPr>
-        <w:t xml:space="preserve"> </w:t>
-      </w:r>
-      <w:r>
-        <w:t>while</w:t>
-      </w:r>
-      <w:r>
-        <w:rPr>
-          <w:spacing w:val="-17"/>
-        </w:rPr>
-        <w:t xml:space="preserve"> </w:t>
-      </w:r>
-      <w:r>
-        <w:t>Her2-enriched</w:t>
-      </w:r>
-      <w:r>
-        <w:rPr>
-          <w:spacing w:val="-18"/>
-        </w:rPr>
-        <w:t xml:space="preserve"> </w:t>
-      </w:r>
-      <w:r>
-        <w:t>and</w:t>
-      </w:r>
-      <w:r>
-        <w:rPr>
-          <w:spacing w:val="-17"/>
-        </w:rPr>
-        <w:t xml:space="preserve"> </w:t>
-      </w:r>
-      <w:r>
-        <w:t>triple-negative</w:t>
-      </w:r>
-      <w:r>
-        <w:rPr>
-          <w:spacing w:val="-18"/>
-        </w:rPr>
-        <w:t xml:space="preserve"> </w:t>
-      </w:r>
-      <w:r>
-        <w:t>BC</w:t>
-      </w:r>
-      <w:r>
-        <w:rPr>
-          <w:spacing w:val="-17"/>
-        </w:rPr>
-        <w:t xml:space="preserve"> </w:t>
-      </w:r>
-      <w:r>
-        <w:rPr>
-          <w:spacing w:val="-3"/>
-        </w:rPr>
-        <w:t>have</w:t>
-      </w:r>
-      <w:r>
-        <w:rPr>
-          <w:spacing w:val="-17"/>
-        </w:rPr>
-        <w:t xml:space="preserve"> </w:t>
-      </w:r>
-      <w:r>
-        <w:t>a</w:t>
-      </w:r>
-      <w:r>
-        <w:rPr>
-          <w:spacing w:val="-18"/>
-        </w:rPr>
-        <w:t xml:space="preserve"> </w:t>
-      </w:r>
-      <w:r>
-        <w:t>poor</w:t>
-      </w:r>
-      <w:r>
-        <w:rPr>
-          <w:spacing w:val="-17"/>
-        </w:rPr>
-        <w:t xml:space="preserve"> </w:t>
-      </w:r>
-      <w:r>
-        <w:t>prognosis</w:t>
-      </w:r>
-      <w:r>
-        <w:rPr>
-          <w:spacing w:val="-17"/>
-        </w:rPr>
-        <w:t xml:space="preserve"> </w:t>
-      </w:r>
-      <w:r>
-        <w:t>(</w:t>
-      </w:r>
-      <w:r>
-        <w:fldChar w:fldCharType="begin"/>
-      </w:r>
-      <w:r>
-        <w:instrText xml:space="preserve"> HYPERLINK \l "_bookmark26" </w:instrText>
-      </w:r>
-      <w:r>
-        <w:fldChar w:fldCharType="separate"/>
-      </w:r>
-      <w:r>
-        <w:t>20</w:t>
-      </w:r>
-      <w:r>
-        <w:fldChar w:fldCharType="end"/>
-      </w:r>
-      <w:r>
-        <w:t>,</w:t>
-      </w:r>
-      <w:r>
-        <w:rPr>
-          <w:spacing w:val="-17"/>
-        </w:rPr>
-        <w:t xml:space="preserve"> </w:t>
-      </w:r>
-      <w:r>
-        <w:fldChar w:fldCharType="begin"/>
-      </w:r>
-      <w:r>
-        <w:instrText xml:space="preserve"> HYPERLINK \l "_bookmark27" </w:instrText>
-      </w:r>
-      <w:r>
-        <w:fldChar w:fldCharType="separate"/>
-      </w:r>
-      <w:r>
-        <w:t>21</w:t>
-      </w:r>
-      <w:r>
-        <w:fldChar w:fldCharType="end"/>
-      </w:r>
-      <w:r>
-        <w:t>,</w:t>
-      </w:r>
-      <w:r>
-        <w:rPr>
-          <w:spacing w:val="-17"/>
-        </w:rPr>
-        <w:t xml:space="preserve"> </w:t>
-      </w:r>
-      <w:r>
-        <w:fldChar w:fldCharType="begin"/>
-      </w:r>
-      <w:r>
-        <w:instrText xml:space="preserve"> HYPERLINK \l "_bookmark28" </w:instrText>
-      </w:r>
-      <w:r>
-        <w:fldChar w:fldCharType="separate"/>
-      </w:r>
-      <w:r>
-        <w:t>22</w:t>
-      </w:r>
-      <w:r>
-        <w:fldChar w:fldCharType="end"/>
-      </w:r>
-      <w:r>
-        <w:t>,</w:t>
-      </w:r>
-      <w:r>
-        <w:rPr>
-          <w:spacing w:val="-18"/>
-        </w:rPr>
-        <w:t xml:space="preserve"> </w:t>
-      </w:r>
-      <w:r>
-        <w:fldChar w:fldCharType="begin"/>
-      </w:r>
-      <w:r>
-        <w:instrText xml:space="preserve"> HYPERLINK \l "_bookmark29" </w:instrText>
-      </w:r>
-      <w:r>
-        <w:fldChar w:fldCharType="separate"/>
-      </w:r>
-      <w:r>
-        <w:t>23</w:t>
-      </w:r>
-      <w:r>
-        <w:fldChar w:fldCharType="end"/>
-      </w:r>
-      <w:r>
-        <w:t>).</w:t>
-      </w:r>
-      <w:r>
-        <w:rPr>
-          <w:spacing w:val="-17"/>
-        </w:rPr>
-        <w:t xml:space="preserve"> </w:t>
-      </w:r>
-      <w:r>
-        <w:t>Similarly,</w:t>
-      </w:r>
-      <w:r>
-        <w:rPr>
-          <w:spacing w:val="-17"/>
-        </w:rPr>
-        <w:t xml:space="preserve"> </w:t>
-      </w:r>
-      <w:r>
-        <w:t>in our experiment, triple-negative breast cancer (BC) and HER2-enriched subtypes were found to be</w:t>
-      </w:r>
-      <w:r>
-        <w:rPr>
-          <w:spacing w:val="-22"/>
-        </w:rPr>
-        <w:t xml:space="preserve"> </w:t>
-      </w:r>
-      <w:r>
-        <w:t xml:space="preserve">highly significant factors for patient survival. Triple-negative BC is associated with poor survival outcomes. In contrast, HER2-positive patients </w:t>
-      </w:r>
-      <w:r>
-        <w:rPr>
-          <w:spacing w:val="-3"/>
-        </w:rPr>
-        <w:t xml:space="preserve">have </w:t>
-      </w:r>
-      <w:r>
-        <w:t>a better prognosis than triple-negative patients, as the advent of the first anti-HER2 monoclonal antibody, trastuzumab, marked the beginning of the targeted therapy era for</w:t>
-      </w:r>
-      <w:r>
-        <w:rPr>
-          <w:spacing w:val="-4"/>
-        </w:rPr>
-        <w:t xml:space="preserve"> </w:t>
-      </w:r>
-      <w:r>
-        <w:t>breast</w:t>
-      </w:r>
-      <w:r>
-        <w:rPr>
-          <w:spacing w:val="-3"/>
-        </w:rPr>
-        <w:t xml:space="preserve"> </w:t>
-      </w:r>
-      <w:r>
-        <w:t>cancer.</w:t>
-      </w:r>
-      <w:r>
-        <w:rPr>
-          <w:spacing w:val="-3"/>
-        </w:rPr>
-        <w:t xml:space="preserve"> </w:t>
-      </w:r>
-      <w:r>
-        <w:t>Real-world</w:t>
-      </w:r>
-      <w:r>
-        <w:rPr>
-          <w:spacing w:val="-3"/>
-        </w:rPr>
-        <w:t xml:space="preserve"> </w:t>
-      </w:r>
-      <w:r>
-        <w:t>studies</w:t>
-      </w:r>
-      <w:r>
-        <w:rPr>
-          <w:spacing w:val="-3"/>
-        </w:rPr>
-        <w:t xml:space="preserve"> </w:t>
-      </w:r>
-      <w:r>
-        <w:t>show</w:t>
-      </w:r>
-      <w:r>
-        <w:rPr>
-          <w:spacing w:val="-3"/>
-        </w:rPr>
-        <w:t xml:space="preserve"> </w:t>
-      </w:r>
-      <w:r>
-        <w:t>that</w:t>
-      </w:r>
-      <w:r>
-        <w:rPr>
-          <w:spacing w:val="-4"/>
-        </w:rPr>
-        <w:t xml:space="preserve"> </w:t>
-      </w:r>
-      <w:r>
-        <w:t>the</w:t>
-      </w:r>
-      <w:r>
-        <w:rPr>
-          <w:spacing w:val="-3"/>
-        </w:rPr>
-        <w:t xml:space="preserve"> </w:t>
-      </w:r>
-      <w:r>
-        <w:t>overall</w:t>
-      </w:r>
-      <w:r>
-        <w:rPr>
-          <w:spacing w:val="-3"/>
-        </w:rPr>
-        <w:t xml:space="preserve"> </w:t>
-      </w:r>
-      <w:r>
-        <w:t>median</w:t>
-      </w:r>
-      <w:r>
-        <w:rPr>
-          <w:spacing w:val="-3"/>
-        </w:rPr>
-        <w:t xml:space="preserve"> </w:t>
-      </w:r>
-      <w:r>
-        <w:t>OS</w:t>
-      </w:r>
-      <w:r>
-        <w:rPr>
-          <w:spacing w:val="-3"/>
-        </w:rPr>
-        <w:t xml:space="preserve"> </w:t>
-      </w:r>
-      <w:r>
-        <w:t>of</w:t>
-      </w:r>
-      <w:r>
-        <w:rPr>
-          <w:spacing w:val="-3"/>
-        </w:rPr>
-        <w:t xml:space="preserve"> </w:t>
-      </w:r>
-      <w:r>
-        <w:t>HER2-positive</w:t>
-      </w:r>
-      <w:r>
-        <w:rPr>
-          <w:spacing w:val="-3"/>
-        </w:rPr>
-        <w:t xml:space="preserve"> </w:t>
-      </w:r>
-      <w:r>
-        <w:t>advanced</w:t>
-      </w:r>
-      <w:r>
-        <w:rPr>
-          <w:spacing w:val="-3"/>
-        </w:rPr>
-        <w:t xml:space="preserve"> </w:t>
-      </w:r>
-      <w:r>
-        <w:t>breast cancer patients continued to increase from 2008 to 2017(</w:t>
-      </w:r>
-      <w:r>
-        <w:fldChar w:fldCharType="begin"/>
-      </w:r>
-      <w:r>
-        <w:instrText xml:space="preserve"> HYPERLINK \l "_bookmark30" </w:instrText>
-      </w:r>
-      <w:r>
-        <w:fldChar w:fldCharType="separate"/>
-      </w:r>
-      <w:r>
-        <w:t>24</w:t>
-      </w:r>
-      <w:r>
-        <w:fldChar w:fldCharType="end"/>
-      </w:r>
-      <w:r>
-        <w:t>).By contrast, Other clinical characteristics investigated</w:t>
-      </w:r>
-      <w:r>
-        <w:rPr>
-          <w:spacing w:val="-5"/>
-        </w:rPr>
-        <w:t xml:space="preserve"> </w:t>
-      </w:r>
-      <w:r>
-        <w:t>in</w:t>
-      </w:r>
-      <w:r>
-        <w:rPr>
-          <w:spacing w:val="-5"/>
-        </w:rPr>
-        <w:t xml:space="preserve"> </w:t>
-      </w:r>
-      <w:r>
-        <w:t>our</w:t>
-      </w:r>
-      <w:r>
-        <w:rPr>
-          <w:spacing w:val="-4"/>
-        </w:rPr>
-        <w:t xml:space="preserve"> </w:t>
-      </w:r>
-      <w:r>
-        <w:t>study</w:t>
-      </w:r>
-      <w:r>
-        <w:rPr>
-          <w:spacing w:val="-5"/>
-        </w:rPr>
-        <w:t xml:space="preserve"> </w:t>
-      </w:r>
-      <w:r>
-        <w:t>did</w:t>
-      </w:r>
-      <w:r>
-        <w:rPr>
-          <w:spacing w:val="-5"/>
-        </w:rPr>
-        <w:t xml:space="preserve"> </w:t>
-      </w:r>
-      <w:r>
-        <w:t>not</w:t>
-      </w:r>
-      <w:r>
-        <w:rPr>
-          <w:spacing w:val="-4"/>
-        </w:rPr>
-        <w:t xml:space="preserve"> </w:t>
-      </w:r>
-      <w:r>
-        <w:t>demonstrate</w:t>
-      </w:r>
-      <w:r>
-        <w:rPr>
-          <w:spacing w:val="-5"/>
-        </w:rPr>
-        <w:t xml:space="preserve"> </w:t>
-      </w:r>
-      <w:r>
-        <w:t>significant</w:t>
-      </w:r>
-      <w:r>
-        <w:rPr>
-          <w:spacing w:val="-4"/>
-        </w:rPr>
-        <w:t xml:space="preserve"> </w:t>
-      </w:r>
-      <w:r>
-        <w:t>importance</w:t>
-      </w:r>
-      <w:r>
-        <w:rPr>
-          <w:spacing w:val="-5"/>
-        </w:rPr>
-        <w:t xml:space="preserve"> </w:t>
-      </w:r>
-      <w:r>
-        <w:t>compared</w:t>
-      </w:r>
-      <w:r>
-        <w:rPr>
-          <w:spacing w:val="-5"/>
-        </w:rPr>
-        <w:t xml:space="preserve"> </w:t>
-      </w:r>
-      <w:r>
-        <w:t>to</w:t>
-      </w:r>
-      <w:r>
-        <w:rPr>
-          <w:spacing w:val="-4"/>
-        </w:rPr>
-        <w:t xml:space="preserve"> </w:t>
-      </w:r>
-      <w:r>
-        <w:t>as</w:t>
-      </w:r>
-      <w:r>
-        <w:rPr>
-          <w:spacing w:val="-5"/>
-        </w:rPr>
-        <w:t xml:space="preserve"> </w:t>
-      </w:r>
-      <w:r>
-        <w:t>these</w:t>
-      </w:r>
-      <w:r>
-        <w:rPr>
-          <w:spacing w:val="-4"/>
-        </w:rPr>
-        <w:t xml:space="preserve"> </w:t>
-      </w:r>
-      <w:r>
-        <w:t>four</w:t>
-      </w:r>
-      <w:r>
-        <w:rPr>
-          <w:spacing w:val="-5"/>
-        </w:rPr>
-        <w:t xml:space="preserve"> </w:t>
-      </w:r>
-      <w:r>
-        <w:t>features.</w:t>
-      </w:r>
-    </w:p>
-    <w:p>
-      <w:pPr>
-        <w:pStyle w:val="4"/>
         <w:spacing w:before="191" w:line="259" w:lineRule="auto"/>
         <w:ind w:left="120" w:right="184" w:firstLine="178"/>
       </w:pPr>
       <w:r>
-        <w:t xml:space="preserve"> </w:t>
+        <w:t xml:space="preserve">were correlated with the choice of surgery type </w:t>
+      </w:r>
+      <w:r>
+        <w:fldChar w:fldCharType="begin"/>
+      </w:r>
+      <w:r>
+        <w:instrText xml:space="preserve"> HYPERLINK \l "_bookmark18" </w:instrText>
+      </w:r>
+      <w:r>
+        <w:fldChar w:fldCharType="separate"/>
+      </w:r>
+      <w:r>
+        <w:t xml:space="preserve">(12, </w:t>
+      </w:r>
+      <w:r>
+        <w:fldChar w:fldCharType="end"/>
+      </w:r>
+      <w:r>
+        <w:fldChar w:fldCharType="begin"/>
+      </w:r>
+      <w:r>
+        <w:instrText xml:space="preserve"> HYPERLINK \l "_bookmark19" </w:instrText>
+      </w:r>
+      <w:r>
+        <w:fldChar w:fldCharType="separate"/>
+      </w:r>
+      <w:r>
+        <w:t xml:space="preserve">13, </w:t>
+      </w:r>
+      <w:r>
+        <w:fldChar w:fldCharType="end"/>
+      </w:r>
+      <w:r>
+        <w:fldChar w:fldCharType="begin"/>
+      </w:r>
+      <w:r>
+        <w:instrText xml:space="preserve"> HYPERLINK \l "_bookmark25" </w:instrText>
+      </w:r>
+      <w:r>
+        <w:fldChar w:fldCharType="separate"/>
+      </w:r>
+      <w:r>
+        <w:t xml:space="preserve">19). </w:t>
+      </w:r>
+      <w:r>
+        <w:fldChar w:fldCharType="end"/>
+      </w:r>
+      <w:r>
+        <w:t>Luminal A and luminal B are linked to</w:t>
+      </w:r>
+      <w:r>
+        <w:rPr>
+          <w:spacing w:val="-43"/>
+        </w:rPr>
+        <w:t xml:space="preserve"> </w:t>
+      </w:r>
+      <w:r>
+        <w:t>good prognosis,</w:t>
+      </w:r>
+      <w:r>
+        <w:rPr>
+          <w:spacing w:val="-18"/>
+        </w:rPr>
+        <w:t xml:space="preserve"> </w:t>
+      </w:r>
+      <w:r>
+        <w:t>while</w:t>
+      </w:r>
+      <w:r>
+        <w:rPr>
+          <w:spacing w:val="-17"/>
+        </w:rPr>
+        <w:t xml:space="preserve"> </w:t>
+      </w:r>
+      <w:r>
+        <w:t>Her2-enriched</w:t>
+      </w:r>
+      <w:r>
+        <w:rPr>
+          <w:spacing w:val="-18"/>
+        </w:rPr>
+        <w:t xml:space="preserve"> </w:t>
+      </w:r>
+      <w:r>
+        <w:t>and</w:t>
+      </w:r>
+      <w:r>
+        <w:rPr>
+          <w:spacing w:val="-17"/>
+        </w:rPr>
+        <w:t xml:space="preserve"> </w:t>
+      </w:r>
+      <w:r>
+        <w:t>triple-negative</w:t>
+      </w:r>
+      <w:r>
+        <w:rPr>
+          <w:spacing w:val="-18"/>
+        </w:rPr>
+        <w:t xml:space="preserve"> </w:t>
+      </w:r>
+      <w:r>
+        <w:t>BC</w:t>
+      </w:r>
+      <w:r>
+        <w:rPr>
+          <w:spacing w:val="-17"/>
+        </w:rPr>
+        <w:t xml:space="preserve"> </w:t>
+      </w:r>
+      <w:r>
+        <w:rPr>
+          <w:spacing w:val="-3"/>
+        </w:rPr>
+        <w:t>have</w:t>
+      </w:r>
+      <w:r>
+        <w:rPr>
+          <w:spacing w:val="-17"/>
+        </w:rPr>
+        <w:t xml:space="preserve"> </w:t>
+      </w:r>
+      <w:r>
+        <w:t>a</w:t>
+      </w:r>
+      <w:r>
+        <w:rPr>
+          <w:spacing w:val="-18"/>
+        </w:rPr>
+        <w:t xml:space="preserve"> </w:t>
+      </w:r>
+      <w:r>
+        <w:t>poor</w:t>
+      </w:r>
+      <w:r>
+        <w:rPr>
+          <w:spacing w:val="-17"/>
+        </w:rPr>
+        <w:t xml:space="preserve"> </w:t>
+      </w:r>
+      <w:r>
+        <w:t>prognosis</w:t>
+      </w:r>
+      <w:r>
+        <w:rPr>
+          <w:spacing w:val="-17"/>
+        </w:rPr>
+        <w:t xml:space="preserve"> </w:t>
+      </w:r>
+      <w:r>
+        <w:t>(</w:t>
+      </w:r>
+      <w:r>
+        <w:fldChar w:fldCharType="begin"/>
+      </w:r>
+      <w:r>
+        <w:instrText xml:space="preserve"> HYPERLINK \l "_bookmark26" </w:instrText>
+      </w:r>
+      <w:r>
+        <w:fldChar w:fldCharType="separate"/>
+      </w:r>
+      <w:r>
+        <w:t>20</w:t>
+      </w:r>
+      <w:r>
+        <w:fldChar w:fldCharType="end"/>
+      </w:r>
+      <w:r>
+        <w:t>,</w:t>
+      </w:r>
+      <w:r>
+        <w:rPr>
+          <w:spacing w:val="-17"/>
+        </w:rPr>
+        <w:t xml:space="preserve"> </w:t>
+      </w:r>
+      <w:r>
+        <w:fldChar w:fldCharType="begin"/>
+      </w:r>
+      <w:r>
+        <w:instrText xml:space="preserve"> HYPERLINK \l "_bookmark27" </w:instrText>
+      </w:r>
+      <w:r>
+        <w:fldChar w:fldCharType="separate"/>
+      </w:r>
+      <w:r>
+        <w:t>21</w:t>
+      </w:r>
+      <w:r>
+        <w:fldChar w:fldCharType="end"/>
+      </w:r>
+      <w:r>
+        <w:t>,</w:t>
+      </w:r>
+      <w:r>
+        <w:rPr>
+          <w:spacing w:val="-17"/>
+        </w:rPr>
+        <w:t xml:space="preserve"> </w:t>
+      </w:r>
+      <w:r>
+        <w:fldChar w:fldCharType="begin"/>
+      </w:r>
+      <w:r>
+        <w:instrText xml:space="preserve"> HYPERLINK \l "_bookmark28" </w:instrText>
+      </w:r>
+      <w:r>
+        <w:fldChar w:fldCharType="separate"/>
+      </w:r>
+      <w:r>
+        <w:t>22</w:t>
+      </w:r>
+      <w:r>
+        <w:fldChar w:fldCharType="end"/>
+      </w:r>
+      <w:r>
+        <w:t>,</w:t>
+      </w:r>
+      <w:r>
+        <w:rPr>
+          <w:spacing w:val="-18"/>
+        </w:rPr>
+        <w:t xml:space="preserve"> </w:t>
+      </w:r>
+      <w:r>
+        <w:fldChar w:fldCharType="begin"/>
+      </w:r>
+      <w:r>
+        <w:instrText xml:space="preserve"> HYPERLINK \l "_bookmark29" </w:instrText>
+      </w:r>
+      <w:r>
+        <w:fldChar w:fldCharType="separate"/>
+      </w:r>
+      <w:r>
+        <w:t>23</w:t>
+      </w:r>
+      <w:r>
+        <w:fldChar w:fldCharType="end"/>
+      </w:r>
+      <w:r>
+        <w:t>).</w:t>
+      </w:r>
+      <w:r>
+        <w:rPr>
+          <w:spacing w:val="-17"/>
+        </w:rPr>
+        <w:t xml:space="preserve"> </w:t>
+      </w:r>
+      <w:r>
+        <w:t>Similarly,</w:t>
+      </w:r>
+      <w:r>
+        <w:rPr>
+          <w:spacing w:val="-17"/>
+        </w:rPr>
+        <w:t xml:space="preserve"> </w:t>
+      </w:r>
+      <w:r>
+        <w:t>in our experiment, triple-negative breast cancer (BC) and HER2-enriched subtypes were found to be</w:t>
+      </w:r>
+      <w:r>
+        <w:rPr>
+          <w:spacing w:val="-22"/>
+        </w:rPr>
+        <w:t xml:space="preserve"> </w:t>
+      </w:r>
+      <w:r>
+        <w:t xml:space="preserve">highly significant factors for patient survival. Triple-negative BC is associated with poor survival outcomes. In contrast, HER2-positive patients </w:t>
+      </w:r>
+      <w:r>
+        <w:rPr>
+          <w:spacing w:val="-3"/>
+        </w:rPr>
+        <w:t xml:space="preserve">have </w:t>
+      </w:r>
+      <w:r>
+        <w:t>a better prognosis than triple-negative patients, as the advent of the first anti-HER2 monoclonal antibody, trastuzumab, marked the beginning of the targeted therapy era for</w:t>
+      </w:r>
+      <w:r>
+        <w:rPr>
+          <w:spacing w:val="-4"/>
+        </w:rPr>
+        <w:t xml:space="preserve"> </w:t>
+      </w:r>
+      <w:r>
+        <w:t>breast</w:t>
+      </w:r>
+      <w:r>
+        <w:rPr>
+          <w:spacing w:val="-3"/>
+        </w:rPr>
+        <w:t xml:space="preserve"> </w:t>
+      </w:r>
+      <w:r>
+        <w:t>cancer.</w:t>
+      </w:r>
+      <w:r>
+        <w:rPr>
+          <w:spacing w:val="-3"/>
+        </w:rPr>
+        <w:t xml:space="preserve"> </w:t>
+      </w:r>
+      <w:r>
+        <w:t>Real-world</w:t>
+      </w:r>
+      <w:r>
+        <w:rPr>
+          <w:spacing w:val="-3"/>
+        </w:rPr>
+        <w:t xml:space="preserve"> </w:t>
+      </w:r>
+      <w:r>
+        <w:t>studies</w:t>
+      </w:r>
+      <w:r>
+        <w:rPr>
+          <w:spacing w:val="-3"/>
+        </w:rPr>
+        <w:t xml:space="preserve"> </w:t>
+      </w:r>
+      <w:r>
+        <w:t>show</w:t>
+      </w:r>
+      <w:r>
+        <w:rPr>
+          <w:spacing w:val="-3"/>
+        </w:rPr>
+        <w:t xml:space="preserve"> </w:t>
+      </w:r>
+      <w:r>
+        <w:t>that</w:t>
+      </w:r>
+      <w:r>
+        <w:rPr>
+          <w:spacing w:val="-4"/>
+        </w:rPr>
+        <w:t xml:space="preserve"> </w:t>
+      </w:r>
+      <w:r>
+        <w:t>the</w:t>
+      </w:r>
+      <w:r>
+        <w:rPr>
+          <w:spacing w:val="-3"/>
+        </w:rPr>
+        <w:t xml:space="preserve"> </w:t>
+      </w:r>
+      <w:r>
+        <w:t>overall</w:t>
+      </w:r>
+      <w:r>
+        <w:rPr>
+          <w:spacing w:val="-3"/>
+        </w:rPr>
+        <w:t xml:space="preserve"> </w:t>
+      </w:r>
+      <w:r>
+        <w:t>median</w:t>
+      </w:r>
+      <w:r>
+        <w:rPr>
+          <w:spacing w:val="-3"/>
+        </w:rPr>
+        <w:t xml:space="preserve"> </w:t>
+      </w:r>
+      <w:r>
+        <w:t>OS</w:t>
+      </w:r>
+      <w:r>
+        <w:rPr>
+          <w:spacing w:val="-3"/>
+        </w:rPr>
+        <w:t xml:space="preserve"> </w:t>
+      </w:r>
+      <w:r>
+        <w:t>of</w:t>
+      </w:r>
+      <w:r>
+        <w:rPr>
+          <w:spacing w:val="-3"/>
+        </w:rPr>
+        <w:t xml:space="preserve"> </w:t>
+      </w:r>
+      <w:r>
+        <w:t>HER2-positive</w:t>
+      </w:r>
+      <w:r>
+        <w:rPr>
+          <w:spacing w:val="-3"/>
+        </w:rPr>
+        <w:t xml:space="preserve"> </w:t>
+      </w:r>
+      <w:r>
+        <w:t>advanced</w:t>
+      </w:r>
+      <w:r>
+        <w:rPr>
+          <w:spacing w:val="-3"/>
+        </w:rPr>
+        <w:t xml:space="preserve"> </w:t>
+      </w:r>
+      <w:r>
+        <w:t>breast cancer patients continued to increase from 2008 to 2017(</w:t>
+      </w:r>
+      <w:r>
+        <w:fldChar w:fldCharType="begin"/>
+      </w:r>
+      <w:r>
+        <w:instrText xml:space="preserve"> HYPERLINK \l "_bookmark30" </w:instrText>
+      </w:r>
+      <w:r>
+        <w:fldChar w:fldCharType="separate"/>
+      </w:r>
+      <w:r>
+        <w:t>24</w:t>
+      </w:r>
+      <w:r>
+        <w:fldChar w:fldCharType="end"/>
+      </w:r>
+      <w:r>
+        <w:t xml:space="preserve">).By contrast, </w:t>
       </w:r>
       <w:r>
         <w:rPr>
           <w:rFonts w:hint="eastAsia"/>
         </w:rPr>
-        <w:t>To improve the method’s relevance in real-world clinical applications, causal inference should be integrated into both the model training and interpretability processes (25, 26, 27). Enhancing the clarity of feature attributions could involve embedding causal model assumptions and applying sample reweighting within the loss function. This strategy could then be evaluated against the performance of our current deep learning model (28, 29, 25).</w:t>
+        <w:t>Compared to these four features, other clinical characteristics investigated were not found to be significantly important.</w:t>
+      </w:r>
+      <w:r>
+        <w:t xml:space="preserve"> </w:t>
+      </w:r>
+      <w:r>
+        <w:rPr>
+          <w:rFonts w:hint="eastAsia"/>
+        </w:rPr>
+        <w:t xml:space="preserve">To improve the method’s relevance in real-world clinical applications, causal inference should be integrated into both the model training and interpretability processes (25, 26, 27). Enhancing the clarity of feature attributions could involve embedding causal model assumptions and applying sample reweighting within the loss function. This strategy could then be evaluated against the performance of our current deep learning model (28, </w:t>
+      </w:r>
+      <w:bookmarkStart w:id="60" w:name="_GoBack"/>
+      <w:bookmarkEnd w:id="60"/>
+      <w:r>
+        <w:rPr>
+          <w:rFonts w:hint="eastAsia"/>
+        </w:rPr>
+        <w:t>29, 25).</w:t>
       </w:r>
     </w:p>
     <w:p>

</xml_diff>

<commit_message>
updated the submission doc
</commit_message>
<xml_diff>
--- a/submission/BRCA-IV-Surgery_Gland_Surg_MAIN_DOC.docx
+++ b/submission/BRCA-IV-Surgery_Gland_Surg_MAIN_DOC.docx
@@ -1730,9 +1730,9 @@
         </w:tabs>
         <w:ind w:left="531"/>
       </w:pPr>
-      <w:bookmarkStart w:id="1" w:name="Method"/>
+      <w:bookmarkStart w:id="1" w:name="Eligibility_Criteria_and_Patient_Informa"/>
       <w:bookmarkEnd w:id="1"/>
-      <w:bookmarkStart w:id="2" w:name="Eligibility_Criteria_and_Patient_Informa"/>
+      <w:bookmarkStart w:id="2" w:name="Method"/>
       <w:bookmarkEnd w:id="2"/>
       <w:r>
         <w:rPr>
@@ -11212,7 +11212,7 @@
       </w:pPr>
       <w:r>
         <w:pict>
-          <v:shape id="_x0000_s2054" o:spid="_x0000_s2054" o:spt="100" style="position:absolute;left:0pt;margin-left:131.65pt;margin-top:37.45pt;height:0.1pt;width:334.25pt;mso-position-horizontal-relative:page;z-index:-251653120;mso-width-relative:page;mso-height-relative:page;" filled="f" coordorigin="2633,750" coordsize="6685,0" adj=",," path="m2633,750l9318,750m2633,750l9318,750e">
+          <v:shape id="_x0000_s2054" o:spid="_x0000_s2054" o:spt="100" style="position:absolute;left:0pt;margin-left:131.65pt;margin-top:37.45pt;height:0.1pt;width:334.25pt;mso-position-horizontal-relative:page;z-index:-251653120;mso-width-relative:page;mso-height-relative:page;" filled="f" coordorigin="2633,750" coordsize="6685,0" adj="" path="m2633,750l9318,750m2633,750l9318,750e">
             <v:path arrowok="t" o:connecttype="segments"/>
             <v:fill on="f" focussize="0,0"/>
             <v:stroke weight="0.498031496062992pt" joinstyle="round"/>
@@ -11652,7 +11652,24 @@
           <w:color w:val="00B0F0"/>
           <w:u w:val="single"/>
         </w:rPr>
-        <w:t>To further evaluate the reliability of our 5-year survival predictions, we examined the calibration curves for both models (Figure X). The neural network showed the closest agreement with the 45° reference line across most probability ranges, indicating well-calibrated and stable probability estimates. In contrast, the Cox proportional hazards model demonstrated larger deviations—particularly at the lower and mid-probability regions—suggesting moderate underestimation of observed survival. Overall, Neural network achieved superior calibration performance at 5 years, providing more accurate alignment between predicted and observed survival probabilities.</w:t>
+        <w:t xml:space="preserve">To further evaluate the reliability of our 5-year survival predictions, we examined the calibration curves for both models (Figure </w:t>
+      </w:r>
+      <w:r>
+        <w:rPr>
+          <w:rFonts w:hint="eastAsia" w:eastAsia="宋体"/>
+          <w:color w:val="00B0F0"/>
+          <w:u w:val="single"/>
+          <w:lang w:val="en-US" w:eastAsia="zh-CN"/>
+        </w:rPr>
+        <w:t>5</w:t>
+      </w:r>
+      <w:r>
+        <w:rPr>
+          <w:rFonts w:hint="eastAsia"/>
+          <w:color w:val="00B0F0"/>
+          <w:u w:val="single"/>
+        </w:rPr>
+        <w:t>). The neural network showed the closest agreement with the 45° reference line across most probability ranges, indicating well-calibrated and stable probability estimates. In contrast, the Cox proportional hazards model demonstrated larger deviations—particularly at the lower and mid-probability regions—suggesting moderate underestimation of observed survival. Overall, Neural network achieved superior calibration performance at 5 years, providing more accurate alignment between predicted and observed survival probabilities.</w:t>
       </w:r>
     </w:p>
     <w:p>
@@ -11735,7 +11752,23 @@
           <w:b/>
           <w:color w:val="00B0F0"/>
         </w:rPr>
-        <w:t xml:space="preserve">Figure 2. </w:t>
+        <w:t xml:space="preserve">Figure </w:t>
+      </w:r>
+      <w:r>
+        <w:rPr>
+          <w:rFonts w:hint="eastAsia" w:eastAsia="宋体"/>
+          <w:b/>
+          <w:color w:val="00B0F0"/>
+          <w:lang w:val="en-US" w:eastAsia="zh-CN"/>
+        </w:rPr>
+        <w:t>5</w:t>
+      </w:r>
+      <w:r>
+        <w:rPr>
+          <w:b/>
+          <w:color w:val="00B0F0"/>
+        </w:rPr>
+        <w:t xml:space="preserve">. </w:t>
       </w:r>
       <w:r>
         <w:rPr>
@@ -11775,8 +11808,6 @@
         </w:rPr>
         <w:t>DISCUSSION</w:t>
       </w:r>
-      <w:bookmarkStart w:id="41" w:name="_GoBack"/>
-      <w:bookmarkEnd w:id="41"/>
     </w:p>
     <w:p>
       <w:pPr>
@@ -17893,853 +17924,6 @@
         <w:tabs>
           <w:tab w:val="left" w:pos="428"/>
         </w:tabs>
-        <w:spacing w:line="259" w:lineRule="auto"/>
-        <w:ind w:left="487" w:right="183" w:hanging="359"/>
-        <w:jc w:val="both"/>
-        <w:rPr>
-          <w:sz w:val="24"/>
-        </w:rPr>
-      </w:pPr>
-      <w:r>
-        <w:rPr>
-          <w:sz w:val="24"/>
-        </w:rPr>
-        <w:t xml:space="preserve">.Smid M, </w:t>
-      </w:r>
-      <w:r>
-        <w:rPr>
-          <w:spacing w:val="-5"/>
-          <w:sz w:val="24"/>
-        </w:rPr>
-        <w:t xml:space="preserve">Wang </w:t>
-      </w:r>
-      <w:r>
-        <w:rPr>
-          <w:spacing w:val="-16"/>
-          <w:sz w:val="24"/>
-        </w:rPr>
-        <w:t xml:space="preserve">Y, </w:t>
-      </w:r>
-      <w:r>
-        <w:rPr>
-          <w:sz w:val="24"/>
-        </w:rPr>
-        <w:t xml:space="preserve">Zhang </w:t>
-      </w:r>
-      <w:r>
-        <w:rPr>
-          <w:spacing w:val="-16"/>
-          <w:sz w:val="24"/>
-        </w:rPr>
-        <w:t xml:space="preserve">Y, </w:t>
-      </w:r>
-      <w:r>
-        <w:rPr>
-          <w:sz w:val="24"/>
-        </w:rPr>
-        <w:t xml:space="preserve">Sieuwerts AM, </w:t>
-      </w:r>
-      <w:r>
-        <w:rPr>
-          <w:spacing w:val="-14"/>
-          <w:sz w:val="24"/>
-        </w:rPr>
-        <w:t xml:space="preserve">Yu </w:t>
-      </w:r>
-      <w:r>
-        <w:rPr>
-          <w:sz w:val="24"/>
-        </w:rPr>
-        <w:t>J, Klijn JG, et al. Subtypes of breast cancer show</w:t>
-      </w:r>
-      <w:bookmarkStart w:id="33" w:name="_bookmark28"/>
-      <w:bookmarkEnd w:id="33"/>
-      <w:r>
-        <w:rPr>
-          <w:sz w:val="24"/>
-        </w:rPr>
-        <w:t xml:space="preserve"> preferential site of relapse. </w:t>
-      </w:r>
-      <w:r>
-        <w:rPr>
-          <w:i/>
-          <w:sz w:val="24"/>
-        </w:rPr>
-        <w:t xml:space="preserve">Cancer </w:t>
-      </w:r>
-      <w:r>
-        <w:rPr>
-          <w:i/>
-          <w:spacing w:val="-3"/>
-          <w:sz w:val="24"/>
-        </w:rPr>
-        <w:t xml:space="preserve">research </w:t>
-      </w:r>
-      <w:r>
-        <w:rPr>
-          <w:b/>
-          <w:sz w:val="24"/>
-        </w:rPr>
-        <w:t xml:space="preserve">68 </w:t>
-      </w:r>
-      <w:r>
-        <w:rPr>
-          <w:sz w:val="24"/>
-        </w:rPr>
-        <w:t>(2008)</w:t>
-      </w:r>
-      <w:r>
-        <w:rPr>
-          <w:spacing w:val="-41"/>
-          <w:sz w:val="24"/>
-        </w:rPr>
-        <w:t xml:space="preserve"> </w:t>
-      </w:r>
-      <w:r>
-        <w:rPr>
-          <w:sz w:val="24"/>
-        </w:rPr>
-        <w:t>3108–3114.</w:t>
-      </w:r>
-    </w:p>
-    <w:p>
-      <w:pPr>
-        <w:pStyle w:val="13"/>
-        <w:numPr>
-          <w:ilvl w:val="0"/>
-          <w:numId w:val="2"/>
-        </w:numPr>
-        <w:tabs>
-          <w:tab w:val="left" w:pos="428"/>
-        </w:tabs>
-        <w:ind w:left="427" w:hanging="300"/>
-        <w:jc w:val="both"/>
-        <w:rPr>
-          <w:sz w:val="24"/>
-        </w:rPr>
-      </w:pPr>
-      <w:r>
-        <w:rPr>
-          <w:sz w:val="24"/>
-        </w:rPr>
-        <w:t>.Rosa</w:t>
-      </w:r>
-      <w:r>
-        <w:rPr>
-          <w:spacing w:val="-7"/>
-          <w:sz w:val="24"/>
-        </w:rPr>
-        <w:t xml:space="preserve"> </w:t>
-      </w:r>
-      <w:r>
-        <w:rPr>
-          <w:sz w:val="24"/>
-        </w:rPr>
-        <w:t>M.</w:t>
-      </w:r>
-      <w:r>
-        <w:rPr>
-          <w:spacing w:val="18"/>
-          <w:sz w:val="24"/>
-        </w:rPr>
-        <w:t xml:space="preserve"> </w:t>
-      </w:r>
-      <w:r>
-        <w:rPr>
-          <w:sz w:val="24"/>
-        </w:rPr>
-        <w:t>Advances</w:t>
-      </w:r>
-      <w:r>
-        <w:rPr>
-          <w:spacing w:val="-7"/>
-          <w:sz w:val="24"/>
-        </w:rPr>
-        <w:t xml:space="preserve"> </w:t>
-      </w:r>
-      <w:r>
-        <w:rPr>
-          <w:sz w:val="24"/>
-        </w:rPr>
-        <w:t>in</w:t>
-      </w:r>
-      <w:r>
-        <w:rPr>
-          <w:spacing w:val="-6"/>
-          <w:sz w:val="24"/>
-        </w:rPr>
-        <w:t xml:space="preserve"> </w:t>
-      </w:r>
-      <w:r>
-        <w:rPr>
-          <w:sz w:val="24"/>
-        </w:rPr>
-        <w:t>the</w:t>
-      </w:r>
-      <w:r>
-        <w:rPr>
-          <w:spacing w:val="-6"/>
-          <w:sz w:val="24"/>
-        </w:rPr>
-        <w:t xml:space="preserve"> </w:t>
-      </w:r>
-      <w:r>
-        <w:rPr>
-          <w:sz w:val="24"/>
-        </w:rPr>
-        <w:t>molecular</w:t>
-      </w:r>
-      <w:r>
-        <w:rPr>
-          <w:spacing w:val="-7"/>
-          <w:sz w:val="24"/>
-        </w:rPr>
-        <w:t xml:space="preserve"> </w:t>
-      </w:r>
-      <w:r>
-        <w:rPr>
-          <w:sz w:val="24"/>
-        </w:rPr>
-        <w:t>analysis</w:t>
-      </w:r>
-      <w:r>
-        <w:rPr>
-          <w:spacing w:val="-6"/>
-          <w:sz w:val="24"/>
-        </w:rPr>
-        <w:t xml:space="preserve"> </w:t>
-      </w:r>
-      <w:r>
-        <w:rPr>
-          <w:sz w:val="24"/>
-        </w:rPr>
-        <w:t>of</w:t>
-      </w:r>
-      <w:r>
-        <w:rPr>
-          <w:spacing w:val="-6"/>
-          <w:sz w:val="24"/>
-        </w:rPr>
-        <w:t xml:space="preserve"> </w:t>
-      </w:r>
-      <w:r>
-        <w:rPr>
-          <w:sz w:val="24"/>
-        </w:rPr>
-        <w:t>breast</w:t>
-      </w:r>
-      <w:r>
-        <w:rPr>
-          <w:spacing w:val="-7"/>
-          <w:sz w:val="24"/>
-        </w:rPr>
-        <w:t xml:space="preserve"> </w:t>
-      </w:r>
-      <w:r>
-        <w:rPr>
-          <w:sz w:val="24"/>
-        </w:rPr>
-        <w:t>cancer:</w:t>
-      </w:r>
-      <w:r>
-        <w:rPr>
-          <w:spacing w:val="-6"/>
-          <w:sz w:val="24"/>
-        </w:rPr>
-        <w:t xml:space="preserve"> </w:t>
-      </w:r>
-      <w:r>
-        <w:rPr>
-          <w:sz w:val="24"/>
-        </w:rPr>
-        <w:t>pathway</w:t>
-      </w:r>
-      <w:r>
-        <w:rPr>
-          <w:spacing w:val="-6"/>
-          <w:sz w:val="24"/>
-        </w:rPr>
-        <w:t xml:space="preserve"> </w:t>
-      </w:r>
-      <w:r>
-        <w:rPr>
-          <w:sz w:val="24"/>
-        </w:rPr>
-        <w:t>toward</w:t>
-      </w:r>
-      <w:r>
-        <w:rPr>
-          <w:spacing w:val="-7"/>
-          <w:sz w:val="24"/>
-        </w:rPr>
-        <w:t xml:space="preserve"> </w:t>
-      </w:r>
-      <w:r>
-        <w:rPr>
-          <w:sz w:val="24"/>
-        </w:rPr>
-        <w:t>personalized</w:t>
-      </w:r>
-      <w:r>
-        <w:rPr>
-          <w:spacing w:val="-6"/>
-          <w:sz w:val="24"/>
-        </w:rPr>
-        <w:t xml:space="preserve"> </w:t>
-      </w:r>
-      <w:r>
-        <w:rPr>
-          <w:sz w:val="24"/>
-        </w:rPr>
-        <w:t>medicine.</w:t>
-      </w:r>
-    </w:p>
-    <w:p>
-      <w:pPr>
-        <w:spacing w:before="23"/>
-        <w:ind w:left="479"/>
-        <w:jc w:val="both"/>
-        <w:rPr>
-          <w:sz w:val="24"/>
-        </w:rPr>
-      </w:pPr>
-      <w:bookmarkStart w:id="34" w:name="_bookmark29"/>
-      <w:bookmarkEnd w:id="34"/>
-      <w:r>
-        <w:rPr>
-          <w:i/>
-          <w:sz w:val="24"/>
-        </w:rPr>
-        <w:t xml:space="preserve">Cancer Control </w:t>
-      </w:r>
-      <w:r>
-        <w:rPr>
-          <w:b/>
-          <w:sz w:val="24"/>
-        </w:rPr>
-        <w:t xml:space="preserve">22 </w:t>
-      </w:r>
-      <w:r>
-        <w:rPr>
-          <w:sz w:val="24"/>
-        </w:rPr>
-        <w:t>(2015) 211–219.</w:t>
-      </w:r>
-    </w:p>
-    <w:p>
-      <w:pPr>
-        <w:pStyle w:val="13"/>
-        <w:numPr>
-          <w:ilvl w:val="0"/>
-          <w:numId w:val="2"/>
-        </w:numPr>
-        <w:tabs>
-          <w:tab w:val="left" w:pos="428"/>
-        </w:tabs>
-        <w:spacing w:before="23" w:line="259" w:lineRule="auto"/>
-        <w:ind w:left="487" w:right="176" w:hanging="359"/>
-        <w:jc w:val="both"/>
-        <w:rPr>
-          <w:sz w:val="24"/>
-        </w:rPr>
-      </w:pPr>
-      <w:r>
-        <w:rPr>
-          <w:sz w:val="24"/>
-        </w:rPr>
-        <w:t xml:space="preserve">.Kast K, Link </w:t>
-      </w:r>
-      <w:r>
-        <w:rPr>
-          <w:spacing w:val="-9"/>
-          <w:sz w:val="24"/>
-        </w:rPr>
-        <w:t xml:space="preserve">T, </w:t>
-      </w:r>
-      <w:r>
-        <w:rPr>
-          <w:sz w:val="24"/>
-        </w:rPr>
-        <w:t xml:space="preserve">Friedrich K, Petzold A, Niedostatek A, Schoffer O, et al. Impact of breast cancer subtypes and patterns of metastasis on outcome. </w:t>
-      </w:r>
-      <w:r>
-        <w:rPr>
-          <w:i/>
-          <w:sz w:val="24"/>
-        </w:rPr>
-        <w:t xml:space="preserve">Breast cancer </w:t>
-      </w:r>
-      <w:r>
-        <w:rPr>
-          <w:i/>
-          <w:spacing w:val="-3"/>
-          <w:sz w:val="24"/>
-        </w:rPr>
-        <w:t xml:space="preserve">research </w:t>
-      </w:r>
-      <w:r>
-        <w:rPr>
-          <w:i/>
-          <w:sz w:val="24"/>
-        </w:rPr>
-        <w:t xml:space="preserve">and treatment </w:t>
-      </w:r>
-      <w:r>
-        <w:rPr>
-          <w:b/>
-          <w:sz w:val="24"/>
-        </w:rPr>
-        <w:t xml:space="preserve">150 </w:t>
-      </w:r>
-      <w:r>
-        <w:rPr>
-          <w:sz w:val="24"/>
-        </w:rPr>
-        <w:t>(2015)</w:t>
-      </w:r>
-      <w:bookmarkStart w:id="35" w:name="_bookmark30"/>
-      <w:bookmarkEnd w:id="35"/>
-      <w:r>
-        <w:rPr>
-          <w:sz w:val="24"/>
-        </w:rPr>
-        <w:t xml:space="preserve"> 621–629.</w:t>
-      </w:r>
-    </w:p>
-    <w:p>
-      <w:pPr>
-        <w:pStyle w:val="13"/>
-        <w:numPr>
-          <w:ilvl w:val="0"/>
-          <w:numId w:val="2"/>
-        </w:numPr>
-        <w:tabs>
-          <w:tab w:val="left" w:pos="428"/>
-        </w:tabs>
-        <w:spacing w:line="259" w:lineRule="auto"/>
-        <w:ind w:left="487" w:right="180" w:hanging="359"/>
-        <w:jc w:val="both"/>
-        <w:rPr>
-          <w:sz w:val="24"/>
-        </w:rPr>
-      </w:pPr>
-      <w:r>
-        <w:rPr>
-          <w:w w:val="99"/>
-          <w:sz w:val="24"/>
-        </w:rPr>
-        <w:t>.</w:t>
-      </w:r>
-      <w:r>
-        <w:rPr>
-          <w:w w:val="101"/>
-          <w:sz w:val="24"/>
-        </w:rPr>
-        <w:t>Grinda</w:t>
-      </w:r>
-      <w:r>
-        <w:rPr>
-          <w:spacing w:val="-1"/>
-          <w:sz w:val="24"/>
-        </w:rPr>
-        <w:t xml:space="preserve"> </w:t>
-      </w:r>
-      <w:r>
-        <w:rPr>
-          <w:spacing w:val="-18"/>
-          <w:w w:val="101"/>
-          <w:sz w:val="24"/>
-        </w:rPr>
-        <w:t>T</w:t>
-      </w:r>
-      <w:r>
-        <w:rPr>
-          <w:w w:val="101"/>
-          <w:sz w:val="24"/>
-        </w:rPr>
-        <w:t>,</w:t>
-      </w:r>
-      <w:r>
-        <w:rPr>
-          <w:spacing w:val="-1"/>
-          <w:sz w:val="24"/>
-        </w:rPr>
-        <w:t xml:space="preserve"> </w:t>
-      </w:r>
-      <w:r>
-        <w:rPr>
-          <w:w w:val="101"/>
-          <w:sz w:val="24"/>
-        </w:rPr>
-        <w:t>Antoine</w:t>
-      </w:r>
-      <w:r>
-        <w:rPr>
-          <w:spacing w:val="-1"/>
-          <w:sz w:val="24"/>
-        </w:rPr>
-        <w:t xml:space="preserve"> </w:t>
-      </w:r>
-      <w:r>
-        <w:rPr>
-          <w:w w:val="101"/>
-          <w:sz w:val="24"/>
-        </w:rPr>
-        <w:t>A,</w:t>
-      </w:r>
-      <w:r>
-        <w:rPr>
-          <w:spacing w:val="-1"/>
-          <w:sz w:val="24"/>
-        </w:rPr>
-        <w:t xml:space="preserve"> </w:t>
-      </w:r>
-      <w:r>
-        <w:rPr>
-          <w:w w:val="101"/>
-          <w:sz w:val="24"/>
-        </w:rPr>
-        <w:t>Jacot</w:t>
-      </w:r>
-      <w:r>
-        <w:rPr>
-          <w:spacing w:val="-1"/>
-          <w:sz w:val="24"/>
-        </w:rPr>
-        <w:t xml:space="preserve"> </w:t>
-      </w:r>
-      <w:r>
-        <w:rPr>
-          <w:spacing w:val="-22"/>
-          <w:w w:val="101"/>
-          <w:sz w:val="24"/>
-        </w:rPr>
-        <w:t>W</w:t>
-      </w:r>
-      <w:r>
-        <w:rPr>
-          <w:w w:val="101"/>
-          <w:sz w:val="24"/>
-        </w:rPr>
-        <w:t>,</w:t>
-      </w:r>
-      <w:r>
-        <w:rPr>
-          <w:spacing w:val="-1"/>
-          <w:sz w:val="24"/>
-        </w:rPr>
-        <w:t xml:space="preserve"> </w:t>
-      </w:r>
-      <w:r>
-        <w:rPr>
-          <w:w w:val="101"/>
-          <w:sz w:val="24"/>
-        </w:rPr>
-        <w:t>Blaye</w:t>
-      </w:r>
-      <w:r>
-        <w:rPr>
-          <w:spacing w:val="-1"/>
-          <w:sz w:val="24"/>
-        </w:rPr>
-        <w:t xml:space="preserve"> </w:t>
-      </w:r>
-      <w:r>
-        <w:rPr>
-          <w:w w:val="101"/>
-          <w:sz w:val="24"/>
-        </w:rPr>
-        <w:t>C,</w:t>
-      </w:r>
-      <w:r>
-        <w:rPr>
-          <w:spacing w:val="-1"/>
-          <w:sz w:val="24"/>
-        </w:rPr>
-        <w:t xml:space="preserve"> </w:t>
-      </w:r>
-      <w:r>
-        <w:rPr>
-          <w:w w:val="101"/>
-          <w:sz w:val="24"/>
-        </w:rPr>
-        <w:t>Cottu</w:t>
-      </w:r>
-      <w:r>
-        <w:rPr>
-          <w:spacing w:val="-1"/>
-          <w:sz w:val="24"/>
-        </w:rPr>
-        <w:t xml:space="preserve"> </w:t>
-      </w:r>
-      <w:r>
-        <w:rPr>
-          <w:w w:val="101"/>
-          <w:sz w:val="24"/>
-        </w:rPr>
-        <w:t>PH,</w:t>
-      </w:r>
-      <w:r>
-        <w:rPr>
-          <w:spacing w:val="-1"/>
-          <w:sz w:val="24"/>
-        </w:rPr>
-        <w:t xml:space="preserve"> </w:t>
-      </w:r>
-      <w:r>
-        <w:rPr>
-          <w:w w:val="101"/>
-          <w:sz w:val="24"/>
-        </w:rPr>
-        <w:t>Di</w:t>
-      </w:r>
-      <w:r>
-        <w:rPr>
-          <w:spacing w:val="-96"/>
-          <w:w w:val="101"/>
-          <w:sz w:val="24"/>
-        </w:rPr>
-        <w:t>e</w:t>
-      </w:r>
-      <w:r>
-        <w:rPr>
-          <w:spacing w:val="15"/>
-          <w:w w:val="99"/>
-          <w:sz w:val="24"/>
-        </w:rPr>
-        <w:t>´</w:t>
-      </w:r>
-      <w:r>
-        <w:rPr>
-          <w:w w:val="101"/>
-          <w:sz w:val="24"/>
-        </w:rPr>
-        <w:t>ras</w:t>
-      </w:r>
-      <w:r>
-        <w:rPr>
-          <w:spacing w:val="-1"/>
-          <w:sz w:val="24"/>
-        </w:rPr>
-        <w:t xml:space="preserve"> </w:t>
-      </w:r>
-      <w:r>
-        <w:rPr>
-          <w:spacing w:val="-31"/>
-          <w:w w:val="101"/>
-          <w:sz w:val="24"/>
-        </w:rPr>
-        <w:t>V</w:t>
-      </w:r>
-      <w:r>
-        <w:rPr>
-          <w:w w:val="101"/>
-          <w:sz w:val="24"/>
-        </w:rPr>
-        <w:t>,</w:t>
-      </w:r>
-      <w:r>
-        <w:rPr>
-          <w:spacing w:val="-1"/>
-          <w:sz w:val="24"/>
-        </w:rPr>
-        <w:t xml:space="preserve"> </w:t>
-      </w:r>
-      <w:r>
-        <w:rPr>
-          <w:w w:val="101"/>
-          <w:sz w:val="24"/>
-        </w:rPr>
-        <w:t>et</w:t>
-      </w:r>
-      <w:r>
-        <w:rPr>
-          <w:spacing w:val="-1"/>
-          <w:sz w:val="24"/>
-        </w:rPr>
-        <w:t xml:space="preserve"> </w:t>
-      </w:r>
-      <w:r>
-        <w:rPr>
-          <w:w w:val="101"/>
-          <w:sz w:val="24"/>
-        </w:rPr>
-        <w:t>al.</w:t>
-      </w:r>
-      <w:r>
-        <w:rPr>
-          <w:spacing w:val="25"/>
-          <w:sz w:val="24"/>
-        </w:rPr>
-        <w:t xml:space="preserve"> </w:t>
-      </w:r>
-      <w:r>
-        <w:rPr>
-          <w:w w:val="101"/>
-          <w:sz w:val="24"/>
-        </w:rPr>
-        <w:t>E</w:t>
-      </w:r>
-      <w:r>
-        <w:rPr>
-          <w:spacing w:val="-5"/>
-          <w:w w:val="101"/>
-          <w:sz w:val="24"/>
-        </w:rPr>
-        <w:t>v</w:t>
-      </w:r>
-      <w:r>
-        <w:rPr>
-          <w:w w:val="101"/>
-          <w:sz w:val="24"/>
-        </w:rPr>
-        <w:t>olution</w:t>
-      </w:r>
-      <w:r>
-        <w:rPr>
-          <w:spacing w:val="-1"/>
-          <w:sz w:val="24"/>
-        </w:rPr>
-        <w:t xml:space="preserve"> </w:t>
-      </w:r>
-      <w:r>
-        <w:rPr>
-          <w:w w:val="101"/>
-          <w:sz w:val="24"/>
-        </w:rPr>
-        <w:t>of</w:t>
-      </w:r>
-      <w:r>
-        <w:rPr>
-          <w:spacing w:val="-1"/>
-          <w:sz w:val="24"/>
-        </w:rPr>
-        <w:t xml:space="preserve"> </w:t>
-      </w:r>
-      <w:r>
-        <w:rPr>
-          <w:spacing w:val="-4"/>
-          <w:w w:val="101"/>
-          <w:sz w:val="24"/>
-        </w:rPr>
-        <w:t>ov</w:t>
-      </w:r>
-      <w:r>
-        <w:rPr>
-          <w:w w:val="101"/>
-          <w:sz w:val="24"/>
-        </w:rPr>
-        <w:t>erall</w:t>
-      </w:r>
-      <w:r>
-        <w:rPr>
-          <w:spacing w:val="-1"/>
-          <w:sz w:val="24"/>
-        </w:rPr>
-        <w:t xml:space="preserve"> </w:t>
-      </w:r>
-      <w:r>
-        <w:rPr>
-          <w:w w:val="101"/>
-          <w:sz w:val="24"/>
-        </w:rPr>
-        <w:t>surv</w:t>
-      </w:r>
-      <w:r>
-        <w:rPr>
-          <w:spacing w:val="-7"/>
-          <w:w w:val="101"/>
-          <w:sz w:val="24"/>
-        </w:rPr>
-        <w:t>i</w:t>
-      </w:r>
-      <w:r>
-        <w:rPr>
-          <w:spacing w:val="-6"/>
-          <w:w w:val="101"/>
-          <w:sz w:val="24"/>
-        </w:rPr>
-        <w:t>v</w:t>
-      </w:r>
-      <w:r>
-        <w:rPr>
-          <w:w w:val="101"/>
-          <w:sz w:val="24"/>
-        </w:rPr>
-        <w:t>al</w:t>
-      </w:r>
-      <w:r>
-        <w:rPr>
-          <w:spacing w:val="-1"/>
-          <w:sz w:val="24"/>
-        </w:rPr>
-        <w:t xml:space="preserve"> </w:t>
-      </w:r>
-      <w:r>
-        <w:rPr>
-          <w:w w:val="101"/>
-          <w:sz w:val="24"/>
-        </w:rPr>
-        <w:t xml:space="preserve">and </w:t>
-      </w:r>
-      <w:r>
-        <w:rPr>
-          <w:sz w:val="24"/>
-        </w:rPr>
-        <w:t>receipt of new therapies by subtype among 20 446 metastatic breast cancer patients in the 2008-2017</w:t>
-      </w:r>
-      <w:bookmarkStart w:id="36" w:name="_bookmark31"/>
-      <w:bookmarkEnd w:id="36"/>
-      <w:r>
-        <w:rPr>
-          <w:sz w:val="24"/>
-        </w:rPr>
-        <w:t xml:space="preserve"> esme cohort. </w:t>
-      </w:r>
-      <w:r>
-        <w:rPr>
-          <w:i/>
-          <w:sz w:val="24"/>
-        </w:rPr>
-        <w:t xml:space="preserve">ESMO open </w:t>
-      </w:r>
-      <w:r>
-        <w:rPr>
-          <w:b/>
-          <w:sz w:val="24"/>
-        </w:rPr>
-        <w:t xml:space="preserve">6 </w:t>
-      </w:r>
-      <w:r>
-        <w:rPr>
-          <w:sz w:val="24"/>
-        </w:rPr>
-        <w:t>(2021)</w:t>
-      </w:r>
-      <w:r>
-        <w:rPr>
-          <w:spacing w:val="-40"/>
-          <w:sz w:val="24"/>
-        </w:rPr>
-        <w:t xml:space="preserve"> </w:t>
-      </w:r>
-      <w:r>
-        <w:rPr>
-          <w:sz w:val="24"/>
-        </w:rPr>
-        <w:t>100114.</w:t>
-      </w:r>
-    </w:p>
-    <w:p>
-      <w:pPr>
-        <w:pStyle w:val="13"/>
-        <w:numPr>
-          <w:ilvl w:val="0"/>
-          <w:numId w:val="2"/>
-        </w:numPr>
-        <w:tabs>
-          <w:tab w:val="left" w:pos="428"/>
-        </w:tabs>
         <w:spacing w:before="3"/>
         <w:ind w:left="427" w:hanging="300"/>
         <w:jc w:val="both"/>
@@ -19002,8 +18186,8 @@
           <w:sz w:val="24"/>
         </w:rPr>
       </w:pPr>
-      <w:bookmarkStart w:id="37" w:name="_bookmark32"/>
-      <w:bookmarkEnd w:id="37"/>
+      <w:bookmarkStart w:id="33" w:name="_bookmark32"/>
+      <w:bookmarkEnd w:id="33"/>
       <w:r>
         <w:rPr>
           <w:i/>
@@ -19219,8 +18403,8 @@
         </w:rPr>
         <w:t>14</w:t>
       </w:r>
-      <w:bookmarkStart w:id="38" w:name="_bookmark33"/>
-      <w:bookmarkEnd w:id="38"/>
+      <w:bookmarkStart w:id="34" w:name="_bookmark33"/>
+      <w:bookmarkEnd w:id="34"/>
       <w:r>
         <w:rPr>
           <w:b/>
@@ -19479,8 +18663,8 @@
         </w:rPr>
         <w:t>to</w:t>
       </w:r>
-      <w:bookmarkStart w:id="39" w:name="_bookmark34"/>
-      <w:bookmarkEnd w:id="39"/>
+      <w:bookmarkStart w:id="35" w:name="_bookmark34"/>
+      <w:bookmarkEnd w:id="35"/>
       <w:r>
         <w:rPr>
           <w:sz w:val="24"/>
@@ -19572,8 +18756,8 @@
         </w:rPr>
         <w:t>arXiv</w:t>
       </w:r>
-      <w:bookmarkStart w:id="40" w:name="_bookmark35"/>
-      <w:bookmarkEnd w:id="40"/>
+      <w:bookmarkStart w:id="36" w:name="_bookmark35"/>
+      <w:bookmarkEnd w:id="36"/>
       <w:r>
         <w:rPr>
           <w:i/>
@@ -19923,6 +19107,604 @@
         </w:rPr>
         <w:t>0467.</w:t>
       </w:r>
+    </w:p>
+    <w:p>
+      <w:pPr>
+        <w:pStyle w:val="2"/>
+        <w:spacing w:before="102"/>
+        <w:ind w:left="174"/>
+        <w:rPr>
+          <w:rFonts w:hint="eastAsia" w:eastAsia="宋体"/>
+          <w:color w:val="231F20"/>
+          <w:lang w:val="en-US" w:eastAsia="zh-CN"/>
+        </w:rPr>
+      </w:pPr>
+      <w:r>
+        <w:rPr>
+          <w:rFonts w:hint="eastAsia" w:eastAsia="宋体"/>
+          <w:color w:val="231F20"/>
+          <w:lang w:val="en-US" w:eastAsia="zh-CN"/>
+        </w:rPr>
+        <w:t>ABBREVIATION</w:t>
+      </w:r>
+    </w:p>
+    <w:p>
+      <w:pPr>
+        <w:pStyle w:val="2"/>
+        <w:spacing w:before="102"/>
+        <w:ind w:left="174"/>
+        <w:rPr>
+          <w:rFonts w:hint="default" w:ascii="Times New Roman" w:hAnsi="Times New Roman" w:eastAsia="Times New Roman" w:cs="Times New Roman"/>
+          <w:b w:val="0"/>
+          <w:bCs w:val="0"/>
+          <w:spacing w:val="-20"/>
+          <w:sz w:val="24"/>
+          <w:szCs w:val="22"/>
+          <w:lang w:val="en-US" w:eastAsia="zh-CN" w:bidi="ar-SA"/>
+        </w:rPr>
+      </w:pPr>
+      <w:r>
+        <w:rPr>
+          <w:rFonts w:hint="default" w:ascii="Times New Roman" w:hAnsi="Times New Roman" w:eastAsia="Times New Roman" w:cs="Times New Roman"/>
+          <w:b w:val="0"/>
+          <w:bCs w:val="0"/>
+          <w:spacing w:val="-20"/>
+          <w:sz w:val="24"/>
+          <w:szCs w:val="22"/>
+          <w:lang w:val="en-US" w:eastAsia="zh-CN" w:bidi="ar-SA"/>
+        </w:rPr>
+        <w:t>overall survival(OS)</w:t>
+      </w:r>
+    </w:p>
+    <w:p>
+      <w:pPr>
+        <w:pStyle w:val="2"/>
+        <w:spacing w:before="102"/>
+        <w:ind w:left="174"/>
+        <w:rPr>
+          <w:rFonts w:hint="default" w:ascii="Times New Roman" w:hAnsi="Times New Roman" w:eastAsia="Times New Roman" w:cs="Times New Roman"/>
+          <w:b w:val="0"/>
+          <w:bCs w:val="0"/>
+          <w:spacing w:val="-20"/>
+          <w:sz w:val="24"/>
+          <w:szCs w:val="22"/>
+          <w:lang w:val="en-US" w:eastAsia="zh-CN" w:bidi="ar-SA"/>
+        </w:rPr>
+      </w:pPr>
+      <w:r>
+        <w:rPr>
+          <w:rFonts w:hint="default" w:ascii="Times New Roman" w:hAnsi="Times New Roman" w:eastAsia="Times New Roman" w:cs="Times New Roman"/>
+          <w:b w:val="0"/>
+          <w:bCs w:val="0"/>
+          <w:spacing w:val="-20"/>
+          <w:sz w:val="24"/>
+          <w:szCs w:val="22"/>
+          <w:lang w:val="en-US" w:eastAsia="zh-CN" w:bidi="ar-SA"/>
+        </w:rPr>
+        <w:t>World</w:t>
+      </w:r>
+      <w:r>
+        <w:rPr>
+          <w:rFonts w:hint="eastAsia" w:ascii="Times New Roman" w:hAnsi="Times New Roman" w:eastAsia="Times New Roman" w:cs="Times New Roman"/>
+          <w:b w:val="0"/>
+          <w:bCs w:val="0"/>
+          <w:spacing w:val="-20"/>
+          <w:sz w:val="24"/>
+          <w:szCs w:val="22"/>
+          <w:lang w:val="en-US" w:eastAsia="zh-CN" w:bidi="ar-SA"/>
+        </w:rPr>
+        <w:t xml:space="preserve"> </w:t>
+      </w:r>
+      <w:r>
+        <w:rPr>
+          <w:rFonts w:hint="default" w:ascii="Times New Roman" w:hAnsi="Times New Roman" w:eastAsia="Times New Roman" w:cs="Times New Roman"/>
+          <w:b w:val="0"/>
+          <w:bCs w:val="0"/>
+          <w:spacing w:val="-20"/>
+          <w:sz w:val="24"/>
+          <w:szCs w:val="22"/>
+          <w:lang w:val="en-US" w:eastAsia="zh-CN" w:bidi="ar-SA"/>
+        </w:rPr>
+        <w:t xml:space="preserve"> Health </w:t>
+      </w:r>
+      <w:r>
+        <w:rPr>
+          <w:rFonts w:hint="eastAsia" w:ascii="Times New Roman" w:hAnsi="Times New Roman" w:eastAsia="Times New Roman" w:cs="Times New Roman"/>
+          <w:b w:val="0"/>
+          <w:bCs w:val="0"/>
+          <w:spacing w:val="-20"/>
+          <w:sz w:val="24"/>
+          <w:szCs w:val="22"/>
+          <w:lang w:val="en-US" w:eastAsia="zh-CN" w:bidi="ar-SA"/>
+        </w:rPr>
+        <w:t xml:space="preserve"> </w:t>
+      </w:r>
+      <w:r>
+        <w:rPr>
+          <w:rFonts w:hint="default" w:ascii="Times New Roman" w:hAnsi="Times New Roman" w:eastAsia="Times New Roman" w:cs="Times New Roman"/>
+          <w:b w:val="0"/>
+          <w:bCs w:val="0"/>
+          <w:spacing w:val="-20"/>
+          <w:sz w:val="24"/>
+          <w:szCs w:val="22"/>
+          <w:lang w:val="en-US" w:eastAsia="zh-CN" w:bidi="ar-SA"/>
+        </w:rPr>
+        <w:t>Organization’s</w:t>
+      </w:r>
+      <w:r>
+        <w:rPr>
+          <w:rFonts w:hint="eastAsia" w:ascii="Times New Roman" w:hAnsi="Times New Roman" w:eastAsia="Times New Roman" w:cs="Times New Roman"/>
+          <w:b w:val="0"/>
+          <w:bCs w:val="0"/>
+          <w:spacing w:val="-20"/>
+          <w:sz w:val="24"/>
+          <w:szCs w:val="22"/>
+          <w:lang w:val="en-US" w:eastAsia="zh-CN" w:bidi="ar-SA"/>
+        </w:rPr>
+        <w:t xml:space="preserve"> </w:t>
+      </w:r>
+      <w:r>
+        <w:rPr>
+          <w:rFonts w:hint="default" w:ascii="Times New Roman" w:hAnsi="Times New Roman" w:eastAsia="Times New Roman" w:cs="Times New Roman"/>
+          <w:b w:val="0"/>
+          <w:bCs w:val="0"/>
+          <w:spacing w:val="-20"/>
+          <w:sz w:val="24"/>
+          <w:szCs w:val="22"/>
+          <w:lang w:val="en-US" w:eastAsia="zh-CN" w:bidi="ar-SA"/>
+        </w:rPr>
+        <w:t xml:space="preserve"> International </w:t>
+      </w:r>
+      <w:r>
+        <w:rPr>
+          <w:rFonts w:hint="eastAsia" w:ascii="Times New Roman" w:hAnsi="Times New Roman" w:eastAsia="Times New Roman" w:cs="Times New Roman"/>
+          <w:b w:val="0"/>
+          <w:bCs w:val="0"/>
+          <w:spacing w:val="-20"/>
+          <w:sz w:val="24"/>
+          <w:szCs w:val="22"/>
+          <w:lang w:val="en-US" w:eastAsia="zh-CN" w:bidi="ar-SA"/>
+        </w:rPr>
+        <w:t xml:space="preserve"> </w:t>
+      </w:r>
+      <w:r>
+        <w:rPr>
+          <w:rFonts w:hint="default" w:ascii="Times New Roman" w:hAnsi="Times New Roman" w:eastAsia="Times New Roman" w:cs="Times New Roman"/>
+          <w:b w:val="0"/>
+          <w:bCs w:val="0"/>
+          <w:spacing w:val="-20"/>
+          <w:sz w:val="24"/>
+          <w:szCs w:val="22"/>
+          <w:lang w:val="en-US" w:eastAsia="zh-CN" w:bidi="ar-SA"/>
+        </w:rPr>
+        <w:t xml:space="preserve">Agency </w:t>
+      </w:r>
+      <w:r>
+        <w:rPr>
+          <w:rFonts w:hint="eastAsia" w:ascii="Times New Roman" w:hAnsi="Times New Roman" w:eastAsia="Times New Roman" w:cs="Times New Roman"/>
+          <w:b w:val="0"/>
+          <w:bCs w:val="0"/>
+          <w:spacing w:val="-20"/>
+          <w:sz w:val="24"/>
+          <w:szCs w:val="22"/>
+          <w:lang w:val="en-US" w:eastAsia="zh-CN" w:bidi="ar-SA"/>
+        </w:rPr>
+        <w:t xml:space="preserve"> </w:t>
+      </w:r>
+      <w:r>
+        <w:rPr>
+          <w:rFonts w:hint="default" w:ascii="Times New Roman" w:hAnsi="Times New Roman" w:eastAsia="Times New Roman" w:cs="Times New Roman"/>
+          <w:b w:val="0"/>
+          <w:bCs w:val="0"/>
+          <w:spacing w:val="-20"/>
+          <w:sz w:val="24"/>
+          <w:szCs w:val="22"/>
+          <w:lang w:val="en-US" w:eastAsia="zh-CN" w:bidi="ar-SA"/>
+        </w:rPr>
+        <w:t xml:space="preserve">for </w:t>
+      </w:r>
+      <w:r>
+        <w:rPr>
+          <w:rFonts w:hint="eastAsia" w:ascii="Times New Roman" w:hAnsi="Times New Roman" w:eastAsia="Times New Roman" w:cs="Times New Roman"/>
+          <w:b w:val="0"/>
+          <w:bCs w:val="0"/>
+          <w:spacing w:val="-20"/>
+          <w:sz w:val="24"/>
+          <w:szCs w:val="22"/>
+          <w:lang w:val="en-US" w:eastAsia="zh-CN" w:bidi="ar-SA"/>
+        </w:rPr>
+        <w:t xml:space="preserve"> </w:t>
+      </w:r>
+      <w:r>
+        <w:rPr>
+          <w:rFonts w:hint="default" w:ascii="Times New Roman" w:hAnsi="Times New Roman" w:eastAsia="Times New Roman" w:cs="Times New Roman"/>
+          <w:b w:val="0"/>
+          <w:bCs w:val="0"/>
+          <w:spacing w:val="-20"/>
+          <w:sz w:val="24"/>
+          <w:szCs w:val="22"/>
+          <w:lang w:val="en-US" w:eastAsia="zh-CN" w:bidi="ar-SA"/>
+        </w:rPr>
+        <w:t xml:space="preserve">Research on </w:t>
+      </w:r>
+      <w:r>
+        <w:rPr>
+          <w:rFonts w:hint="eastAsia" w:ascii="Times New Roman" w:hAnsi="Times New Roman" w:eastAsia="Times New Roman" w:cs="Times New Roman"/>
+          <w:b w:val="0"/>
+          <w:bCs w:val="0"/>
+          <w:spacing w:val="-20"/>
+          <w:sz w:val="24"/>
+          <w:szCs w:val="22"/>
+          <w:lang w:val="en-US" w:eastAsia="zh-CN" w:bidi="ar-SA"/>
+        </w:rPr>
+        <w:t xml:space="preserve"> </w:t>
+      </w:r>
+      <w:r>
+        <w:rPr>
+          <w:rFonts w:hint="default" w:ascii="Times New Roman" w:hAnsi="Times New Roman" w:eastAsia="Times New Roman" w:cs="Times New Roman"/>
+          <w:b w:val="0"/>
+          <w:bCs w:val="0"/>
+          <w:spacing w:val="-20"/>
+          <w:sz w:val="24"/>
+          <w:szCs w:val="22"/>
+          <w:lang w:val="en-US" w:eastAsia="zh-CN" w:bidi="ar-SA"/>
+        </w:rPr>
+        <w:t>Cancer (IARC)</w:t>
+      </w:r>
+    </w:p>
+    <w:p>
+      <w:pPr>
+        <w:pStyle w:val="2"/>
+        <w:spacing w:before="102"/>
+        <w:ind w:left="174"/>
+        <w:rPr>
+          <w:rFonts w:hint="default" w:ascii="Times New Roman" w:hAnsi="Times New Roman" w:eastAsia="Times New Roman" w:cs="Times New Roman"/>
+          <w:b w:val="0"/>
+          <w:bCs w:val="0"/>
+          <w:spacing w:val="-20"/>
+          <w:sz w:val="24"/>
+          <w:szCs w:val="22"/>
+          <w:lang w:val="en-US" w:eastAsia="zh-CN" w:bidi="ar-SA"/>
+        </w:rPr>
+      </w:pPr>
+      <w:r>
+        <w:rPr>
+          <w:rFonts w:hint="default" w:ascii="Times New Roman" w:hAnsi="Times New Roman" w:eastAsia="Times New Roman" w:cs="Times New Roman"/>
+          <w:b w:val="0"/>
+          <w:bCs w:val="0"/>
+          <w:spacing w:val="-20"/>
+          <w:sz w:val="24"/>
+          <w:szCs w:val="22"/>
+          <w:lang w:val="en-US" w:eastAsia="zh-CN" w:bidi="ar-SA"/>
+        </w:rPr>
+        <w:t>Metastatic (M1)</w:t>
+      </w:r>
+      <w:r>
+        <w:rPr>
+          <w:rFonts w:hint="eastAsia" w:ascii="Times New Roman" w:hAnsi="Times New Roman" w:eastAsia="Times New Roman" w:cs="Times New Roman"/>
+          <w:b w:val="0"/>
+          <w:bCs w:val="0"/>
+          <w:spacing w:val="-20"/>
+          <w:sz w:val="24"/>
+          <w:szCs w:val="22"/>
+          <w:lang w:val="en-US" w:eastAsia="zh-CN" w:bidi="ar-SA"/>
+        </w:rPr>
+        <w:t xml:space="preserve"> </w:t>
+      </w:r>
+      <w:r>
+        <w:rPr>
+          <w:rFonts w:hint="default" w:ascii="Times New Roman" w:hAnsi="Times New Roman" w:eastAsia="Times New Roman" w:cs="Times New Roman"/>
+          <w:b w:val="0"/>
+          <w:bCs w:val="0"/>
+          <w:spacing w:val="-20"/>
+          <w:sz w:val="24"/>
+          <w:szCs w:val="22"/>
+          <w:lang w:val="en-US" w:eastAsia="zh-CN" w:bidi="ar-SA"/>
+        </w:rPr>
+        <w:t xml:space="preserve"> breast </w:t>
+      </w:r>
+      <w:r>
+        <w:rPr>
+          <w:rFonts w:hint="eastAsia" w:ascii="Times New Roman" w:hAnsi="Times New Roman" w:eastAsia="Times New Roman" w:cs="Times New Roman"/>
+          <w:b w:val="0"/>
+          <w:bCs w:val="0"/>
+          <w:spacing w:val="-20"/>
+          <w:sz w:val="24"/>
+          <w:szCs w:val="22"/>
+          <w:lang w:val="en-US" w:eastAsia="zh-CN" w:bidi="ar-SA"/>
+        </w:rPr>
+        <w:t xml:space="preserve"> </w:t>
+      </w:r>
+      <w:r>
+        <w:rPr>
+          <w:rFonts w:hint="default" w:ascii="Times New Roman" w:hAnsi="Times New Roman" w:eastAsia="Times New Roman" w:cs="Times New Roman"/>
+          <w:b w:val="0"/>
+          <w:bCs w:val="0"/>
+          <w:spacing w:val="-20"/>
+          <w:sz w:val="24"/>
+          <w:szCs w:val="22"/>
+          <w:lang w:val="en-US" w:eastAsia="zh-CN" w:bidi="ar-SA"/>
+        </w:rPr>
+        <w:t>cancer (MBC)</w:t>
+      </w:r>
+    </w:p>
+    <w:p>
+      <w:pPr>
+        <w:pStyle w:val="2"/>
+        <w:spacing w:before="102"/>
+        <w:ind w:left="174"/>
+        <w:rPr>
+          <w:rFonts w:hint="default" w:ascii="Times New Roman" w:hAnsi="Times New Roman" w:eastAsia="Times New Roman" w:cs="Times New Roman"/>
+          <w:b w:val="0"/>
+          <w:bCs w:val="0"/>
+          <w:spacing w:val="-20"/>
+          <w:sz w:val="24"/>
+          <w:szCs w:val="22"/>
+          <w:lang w:val="en-US" w:eastAsia="zh-CN" w:bidi="ar-SA"/>
+        </w:rPr>
+      </w:pPr>
+      <w:r>
+        <w:rPr>
+          <w:rFonts w:hint="default" w:ascii="Times New Roman" w:hAnsi="Times New Roman" w:eastAsia="Times New Roman" w:cs="Times New Roman"/>
+          <w:b w:val="0"/>
+          <w:bCs w:val="0"/>
+          <w:spacing w:val="-20"/>
+          <w:sz w:val="24"/>
+          <w:szCs w:val="22"/>
+          <w:lang w:val="en-US" w:eastAsia="zh-CN" w:bidi="ar-SA"/>
+        </w:rPr>
+        <w:t xml:space="preserve">concordance </w:t>
+      </w:r>
+      <w:r>
+        <w:rPr>
+          <w:rFonts w:hint="eastAsia" w:ascii="Times New Roman" w:hAnsi="Times New Roman" w:eastAsia="Times New Roman" w:cs="Times New Roman"/>
+          <w:b w:val="0"/>
+          <w:bCs w:val="0"/>
+          <w:spacing w:val="-20"/>
+          <w:sz w:val="24"/>
+          <w:szCs w:val="22"/>
+          <w:lang w:val="en-US" w:eastAsia="zh-CN" w:bidi="ar-SA"/>
+        </w:rPr>
+        <w:t xml:space="preserve"> </w:t>
+      </w:r>
+      <w:r>
+        <w:rPr>
+          <w:rFonts w:hint="default" w:ascii="Times New Roman" w:hAnsi="Times New Roman" w:eastAsia="Times New Roman" w:cs="Times New Roman"/>
+          <w:b w:val="0"/>
+          <w:bCs w:val="0"/>
+          <w:spacing w:val="-20"/>
+          <w:sz w:val="24"/>
+          <w:szCs w:val="22"/>
+          <w:lang w:val="en-US" w:eastAsia="zh-CN" w:bidi="ar-SA"/>
+        </w:rPr>
+        <w:t>index (C</w:t>
+      </w:r>
+      <w:r>
+        <w:rPr>
+          <w:rFonts w:hint="default" w:ascii="Times New Roman" w:hAnsi="Times New Roman" w:eastAsia="Times New Roman" w:cs="Times New Roman"/>
+          <w:b w:val="0"/>
+          <w:bCs w:val="0"/>
+          <w:spacing w:val="-20"/>
+          <w:sz w:val="24"/>
+          <w:szCs w:val="22"/>
+          <w:lang w:val="en-US" w:eastAsia="zh-CN" w:bidi="ar-SA"/>
+        </w:rPr>
+        <w:noBreakHyphen/>
+      </w:r>
+      <w:r>
+        <w:rPr>
+          <w:rFonts w:hint="default" w:ascii="Times New Roman" w:hAnsi="Times New Roman" w:eastAsia="Times New Roman" w:cs="Times New Roman"/>
+          <w:b w:val="0"/>
+          <w:bCs w:val="0"/>
+          <w:spacing w:val="-20"/>
+          <w:sz w:val="24"/>
+          <w:szCs w:val="22"/>
+          <w:lang w:val="en-US" w:eastAsia="zh-CN" w:bidi="ar-SA"/>
+        </w:rPr>
+        <w:t>index)</w:t>
+      </w:r>
+    </w:p>
+    <w:p>
+      <w:pPr>
+        <w:pStyle w:val="2"/>
+        <w:spacing w:before="102"/>
+        <w:ind w:left="174"/>
+        <w:rPr>
+          <w:rFonts w:hint="default" w:ascii="Times New Roman" w:hAnsi="Times New Roman" w:eastAsia="Times New Roman" w:cs="Times New Roman"/>
+          <w:b w:val="0"/>
+          <w:bCs w:val="0"/>
+          <w:spacing w:val="-20"/>
+          <w:sz w:val="24"/>
+          <w:szCs w:val="22"/>
+          <w:lang w:val="en-US" w:eastAsia="zh-CN" w:bidi="ar-SA"/>
+        </w:rPr>
+      </w:pPr>
+      <w:r>
+        <w:rPr>
+          <w:rFonts w:hint="default" w:ascii="Times New Roman" w:hAnsi="Times New Roman" w:eastAsia="Times New Roman" w:cs="Times New Roman"/>
+          <w:b w:val="0"/>
+          <w:bCs w:val="0"/>
+          <w:spacing w:val="-20"/>
+          <w:sz w:val="24"/>
+          <w:szCs w:val="22"/>
+          <w:lang w:val="en-US" w:eastAsia="zh-CN" w:bidi="ar-SA"/>
+        </w:rPr>
+        <w:t xml:space="preserve">breast-cancer–specific </w:t>
+      </w:r>
+      <w:r>
+        <w:rPr>
+          <w:rFonts w:hint="eastAsia" w:ascii="Times New Roman" w:hAnsi="Times New Roman" w:eastAsia="Times New Roman" w:cs="Times New Roman"/>
+          <w:b w:val="0"/>
+          <w:bCs w:val="0"/>
+          <w:spacing w:val="-20"/>
+          <w:sz w:val="24"/>
+          <w:szCs w:val="22"/>
+          <w:lang w:val="en-US" w:eastAsia="zh-CN" w:bidi="ar-SA"/>
+        </w:rPr>
+        <w:t xml:space="preserve"> </w:t>
+      </w:r>
+      <w:r>
+        <w:rPr>
+          <w:rFonts w:hint="default" w:ascii="Times New Roman" w:hAnsi="Times New Roman" w:eastAsia="Times New Roman" w:cs="Times New Roman"/>
+          <w:b w:val="0"/>
+          <w:bCs w:val="0"/>
+          <w:spacing w:val="-20"/>
+          <w:sz w:val="24"/>
+          <w:szCs w:val="22"/>
+          <w:lang w:val="en-US" w:eastAsia="zh-CN" w:bidi="ar-SA"/>
+        </w:rPr>
+        <w:t>survival (BCSS)</w:t>
+      </w:r>
+      <w:bookmarkStart w:id="37" w:name="_GoBack"/>
+      <w:bookmarkEnd w:id="37"/>
+    </w:p>
+    <w:p>
+      <w:pPr>
+        <w:pStyle w:val="2"/>
+        <w:spacing w:before="102"/>
+        <w:ind w:left="174"/>
+        <w:rPr>
+          <w:rFonts w:hint="default" w:ascii="Times New Roman" w:hAnsi="Times New Roman" w:eastAsia="Times New Roman" w:cs="Times New Roman"/>
+          <w:b w:val="0"/>
+          <w:bCs w:val="0"/>
+          <w:spacing w:val="-20"/>
+          <w:sz w:val="24"/>
+          <w:szCs w:val="22"/>
+          <w:lang w:val="en-US" w:eastAsia="zh-CN" w:bidi="ar-SA"/>
+        </w:rPr>
+      </w:pPr>
+      <w:r>
+        <w:rPr>
+          <w:rFonts w:hint="default" w:ascii="Times New Roman" w:hAnsi="Times New Roman" w:eastAsia="Times New Roman" w:cs="Times New Roman"/>
+          <w:b w:val="0"/>
+          <w:bCs w:val="0"/>
+          <w:spacing w:val="-20"/>
+          <w:sz w:val="24"/>
+          <w:szCs w:val="22"/>
+          <w:lang w:val="en-US" w:eastAsia="zh-CN" w:bidi="ar-SA"/>
+        </w:rPr>
+        <w:t xml:space="preserve">Rectified </w:t>
+      </w:r>
+      <w:r>
+        <w:rPr>
+          <w:rFonts w:hint="eastAsia" w:ascii="Times New Roman" w:hAnsi="Times New Roman" w:eastAsia="Times New Roman" w:cs="Times New Roman"/>
+          <w:b w:val="0"/>
+          <w:bCs w:val="0"/>
+          <w:spacing w:val="-20"/>
+          <w:sz w:val="24"/>
+          <w:szCs w:val="22"/>
+          <w:lang w:val="en-US" w:eastAsia="zh-CN" w:bidi="ar-SA"/>
+        </w:rPr>
+        <w:t xml:space="preserve"> </w:t>
+      </w:r>
+      <w:r>
+        <w:rPr>
+          <w:rFonts w:hint="default" w:ascii="Times New Roman" w:hAnsi="Times New Roman" w:eastAsia="Times New Roman" w:cs="Times New Roman"/>
+          <w:b w:val="0"/>
+          <w:bCs w:val="0"/>
+          <w:spacing w:val="-20"/>
+          <w:sz w:val="24"/>
+          <w:szCs w:val="22"/>
+          <w:lang w:val="en-US" w:eastAsia="zh-CN" w:bidi="ar-SA"/>
+        </w:rPr>
+        <w:t xml:space="preserve">Linear Unit (ReLU) </w:t>
+      </w:r>
+    </w:p>
+    <w:p>
+      <w:pPr>
+        <w:pStyle w:val="2"/>
+        <w:spacing w:before="102"/>
+        <w:ind w:left="174"/>
+        <w:rPr>
+          <w:rFonts w:hint="default" w:ascii="Times New Roman" w:hAnsi="Times New Roman" w:eastAsia="Times New Roman" w:cs="Times New Roman"/>
+          <w:b w:val="0"/>
+          <w:bCs w:val="0"/>
+          <w:spacing w:val="-20"/>
+          <w:sz w:val="24"/>
+          <w:szCs w:val="22"/>
+          <w:lang w:val="en-US" w:eastAsia="zh-CN" w:bidi="ar-SA"/>
+        </w:rPr>
+      </w:pPr>
+      <w:r>
+        <w:rPr>
+          <w:rFonts w:hint="default" w:ascii="Times New Roman" w:hAnsi="Times New Roman" w:eastAsia="Times New Roman" w:cs="Times New Roman"/>
+          <w:b w:val="0"/>
+          <w:bCs w:val="0"/>
+          <w:spacing w:val="-20"/>
+          <w:sz w:val="24"/>
+          <w:szCs w:val="22"/>
+          <w:lang w:val="en-US" w:eastAsia="zh-CN" w:bidi="ar-SA"/>
+        </w:rPr>
+        <w:t xml:space="preserve"> Propensity </w:t>
+      </w:r>
+      <w:r>
+        <w:rPr>
+          <w:rFonts w:hint="eastAsia" w:ascii="Times New Roman" w:hAnsi="Times New Roman" w:eastAsia="Times New Roman" w:cs="Times New Roman"/>
+          <w:b w:val="0"/>
+          <w:bCs w:val="0"/>
+          <w:spacing w:val="-20"/>
+          <w:sz w:val="24"/>
+          <w:szCs w:val="22"/>
+          <w:lang w:val="en-US" w:eastAsia="zh-CN" w:bidi="ar-SA"/>
+        </w:rPr>
+        <w:t xml:space="preserve"> </w:t>
+      </w:r>
+      <w:r>
+        <w:rPr>
+          <w:rFonts w:hint="default" w:ascii="Times New Roman" w:hAnsi="Times New Roman" w:eastAsia="Times New Roman" w:cs="Times New Roman"/>
+          <w:b w:val="0"/>
+          <w:bCs w:val="0"/>
+          <w:spacing w:val="-20"/>
+          <w:sz w:val="24"/>
+          <w:szCs w:val="22"/>
+          <w:lang w:val="en-US" w:eastAsia="zh-CN" w:bidi="ar-SA"/>
+        </w:rPr>
+        <w:t xml:space="preserve">score </w:t>
+      </w:r>
+      <w:r>
+        <w:rPr>
+          <w:rFonts w:hint="eastAsia" w:ascii="Times New Roman" w:hAnsi="Times New Roman" w:eastAsia="Times New Roman" w:cs="Times New Roman"/>
+          <w:b w:val="0"/>
+          <w:bCs w:val="0"/>
+          <w:spacing w:val="-20"/>
+          <w:sz w:val="24"/>
+          <w:szCs w:val="22"/>
+          <w:lang w:val="en-US" w:eastAsia="zh-CN" w:bidi="ar-SA"/>
+        </w:rPr>
+        <w:t xml:space="preserve"> </w:t>
+      </w:r>
+      <w:r>
+        <w:rPr>
+          <w:rFonts w:hint="default" w:ascii="Times New Roman" w:hAnsi="Times New Roman" w:eastAsia="Times New Roman" w:cs="Times New Roman"/>
+          <w:b w:val="0"/>
+          <w:bCs w:val="0"/>
+          <w:spacing w:val="-20"/>
+          <w:sz w:val="24"/>
+          <w:szCs w:val="22"/>
+          <w:lang w:val="en-US" w:eastAsia="zh-CN" w:bidi="ar-SA"/>
+        </w:rPr>
+        <w:t>matching (PSM)</w:t>
+      </w:r>
+    </w:p>
+    <w:p>
+      <w:pPr>
+        <w:pStyle w:val="13"/>
+        <w:widowControl w:val="0"/>
+        <w:numPr>
+          <w:numId w:val="0"/>
+        </w:numPr>
+        <w:tabs>
+          <w:tab w:val="left" w:pos="428"/>
+        </w:tabs>
+        <w:autoSpaceDE w:val="0"/>
+        <w:autoSpaceDN w:val="0"/>
+        <w:spacing w:before="1" w:line="259" w:lineRule="auto"/>
+        <w:ind w:right="192" w:rightChars="0"/>
+        <w:jc w:val="both"/>
+        <w:rPr>
+          <w:sz w:val="24"/>
+        </w:rPr>
+      </w:pPr>
     </w:p>
     <w:sectPr>
       <w:pgSz w:w="11910" w:h="16840"/>
@@ -20421,7 +20203,7 @@
     <w:lsdException w:unhideWhenUsed="0" w:uiPriority="0" w:semiHidden="0" w:name="envelope return"/>
     <w:lsdException w:unhideWhenUsed="0" w:uiPriority="0" w:semiHidden="0" w:name="footnote reference"/>
     <w:lsdException w:unhideWhenUsed="0" w:uiPriority="0" w:semiHidden="0" w:name="annotation reference"/>
-    <w:lsdException w:unhideWhenUsed="0" w:uiPriority="0" w:semiHidden="0" w:name="line number"/>
+    <w:lsdException w:qFormat="1" w:unhideWhenUsed="0" w:uiPriority="0" w:semiHidden="0" w:name="line number"/>
     <w:lsdException w:unhideWhenUsed="0" w:uiPriority="0" w:semiHidden="0" w:name="page number"/>
     <w:lsdException w:unhideWhenUsed="0" w:uiPriority="0" w:semiHidden="0" w:name="endnote reference"/>
     <w:lsdException w:unhideWhenUsed="0" w:uiPriority="0" w:semiHidden="0" w:name="endnote text"/>
@@ -20484,7 +20266,7 @@
     <w:lsdException w:unhideWhenUsed="0" w:uiPriority="0" w:semiHidden="0" w:name="HTML Sample"/>
     <w:lsdException w:unhideWhenUsed="0" w:uiPriority="0" w:semiHidden="0" w:name="HTML Typewriter"/>
     <w:lsdException w:unhideWhenUsed="0" w:uiPriority="0" w:semiHidden="0" w:name="HTML Variable"/>
-    <w:lsdException w:uiPriority="99" w:name="Normal Table"/>
+    <w:lsdException w:qFormat="1" w:uiPriority="99" w:name="Normal Table"/>
     <w:lsdException w:unhideWhenUsed="0" w:uiPriority="0" w:semiHidden="0" w:name="annotation subject"/>
     <w:lsdException w:uiPriority="0" w:name="Table Simple 1"/>
     <w:lsdException w:uiPriority="0" w:name="Table Simple 2"/>
@@ -20690,6 +20472,7 @@
     <w:name w:val="Normal Table"/>
     <w:semiHidden/>
     <w:unhideWhenUsed/>
+    <w:qFormat/>
     <w:uiPriority w:val="99"/>
     <w:tblPr>
       <w:tblCellMar>
@@ -20770,6 +20553,7 @@
   <w:style w:type="character" w:styleId="10">
     <w:name w:val="line number"/>
     <w:basedOn w:val="9"/>
+    <w:qFormat/>
     <w:uiPriority w:val="0"/>
   </w:style>
   <w:style w:type="character" w:styleId="11">
@@ -20823,6 +20607,7 @@
     <w:name w:val="正文文本 字符"/>
     <w:basedOn w:val="9"/>
     <w:link w:val="4"/>
+    <w:qFormat/>
     <w:uiPriority w:val="1"/>
     <w:rPr>
       <w:rFonts w:eastAsia="Times New Roman"/>
@@ -20836,6 +20621,7 @@
     <w:basedOn w:val="9"/>
     <w:semiHidden/>
     <w:unhideWhenUsed/>
+    <w:qFormat/>
     <w:uiPriority w:val="99"/>
     <w:rPr>
       <w:color w:val="605E5C"/>

</xml_diff>